<commit_message>
feat: bonus challenge 1 implemnted bestvalue finder endpoint fix: resolve best-value endpoint returning empty object by fixing getAllWithCities implementation postman screenshots of endpoints
</commit_message>
<xml_diff>
--- a/documentation/Documentation and Design Decisions.docx
+++ b/documentation/Documentation and Design Decisions.docx
@@ -396,6 +396,19 @@
           <w:lang w:val="en-US"/>
         </w:rPr>
       </w:pPr>
+    </w:p>
+    <w:p>
+      <w:pPr>
+        <w:rPr>
+          <w:lang w:val="en-US"/>
+        </w:rPr>
+      </w:pPr>
+      <w:r>
+        <w:rPr>
+          <w:lang w:val="en-US"/>
+        </w:rPr>
+        <w:t>// say about listys not being added – sjouyld be disabled to avoid copnfuyasion</w:t>
+      </w:r>
     </w:p>
     <w:p>
       <w:pPr>

</xml_diff>

<commit_message>
update to documentation for more notes
</commit_message>
<xml_diff>
--- a/documentation/Documentation and Design Decisions.docx
+++ b/documentation/Documentation and Design Decisions.docx
@@ -387,7 +387,10 @@
         <w:pStyle w:val="Heading1"/>
       </w:pPr>
       <w:r>
-        <w:t>Future Improvemements</w:t>
+        <w:t xml:space="preserve">Future </w:t>
+      </w:r>
+      <w:r>
+        <w:t>Improvement’s</w:t>
       </w:r>
     </w:p>
     <w:p>
@@ -421,6 +424,51 @@
           <w:lang w:val="en-US"/>
         </w:rPr>
         <w:t>// future imptove,ents – ci/cd pii[r;ines of tests, postgre dickerised depkoy it on   rancher</w:t>
+      </w:r>
+    </w:p>
+    <w:p>
+      <w:pPr>
+        <w:rPr>
+          <w:lang w:val="en-US"/>
+        </w:rPr>
+      </w:pPr>
+      <w:r>
+        <w:rPr>
+          <w:lang w:val="en-US"/>
+        </w:rPr>
+        <w:t xml:space="preserve">// more testing  ofd backewnd </w:t>
+      </w:r>
+    </w:p>
+    <w:p>
+      <w:pPr>
+        <w:rPr>
+          <w:lang w:val="en-US"/>
+        </w:rPr>
+      </w:pPr>
+      <w:r>
+        <w:rPr>
+          <w:lang w:val="en-US"/>
+        </w:rPr>
+        <w:t xml:space="preserve">// </w:t>
+      </w:r>
+      <w:r>
+        <w:rPr>
+          <w:lang w:val="en-US"/>
+        </w:rPr>
+        <w:t>itenerials endpoinyts</w:t>
+      </w:r>
+    </w:p>
+    <w:p>
+      <w:pPr>
+        <w:rPr>
+          <w:lang w:val="en-US"/>
+        </w:rPr>
+      </w:pPr>
+      <w:r>
+        <w:rPr>
+          <w:lang w:val="en-US"/>
+        </w:rPr>
+        <w:t>// have photos</w:t>
       </w:r>
     </w:p>
     <w:sectPr>

</xml_diff>

<commit_message>
feat: implement BestValueDialog match rendering with formatted date/time and safe data handling
</commit_message>
<xml_diff>
--- a/documentation/Documentation and Design Decisions.docx
+++ b/documentation/Documentation and Design Decisions.docx
@@ -381,7 +381,11 @@
         <w:t xml:space="preserve">Bonus Challenge </w:t>
       </w:r>
     </w:p>
-    <w:p/>
+    <w:p>
+      <w:r>
+        <w:t>// code was alreadlu provided for part 2</w:t>
+      </w:r>
+    </w:p>
     <w:p>
       <w:pPr>
         <w:pStyle w:val="Heading1"/>

</xml_diff>

<commit_message>
fixed small typo in README.md
</commit_message>
<xml_diff>
--- a/documentation/Documentation and Design Decisions.docx
+++ b/documentation/Documentation and Design Decisions.docx
@@ -123,7 +123,7 @@
           <w:r>
             <w:fldChar w:fldCharType="separate"/>
           </w:r>
-          <w:hyperlink w:anchor="_Toc226732815" w:history="1">
+          <w:hyperlink w:anchor="_Toc226735788" w:history="1">
             <w:r>
               <w:rPr>
                 <w:rStyle w:val="Hyperlink"/>
@@ -151,7 +151,7 @@
                 <w:noProof/>
                 <w:webHidden/>
               </w:rPr>
-              <w:instrText xml:space="preserve"> PAGEREF _Toc226732815 \h </w:instrText>
+              <w:instrText xml:space="preserve"> PAGEREF _Toc226735788 \h </w:instrText>
             </w:r>
             <w:r>
               <w:rPr>
@@ -196,7 +196,7 @@
               <w:lang w:eastAsia="en-GB"/>
             </w:rPr>
           </w:pPr>
-          <w:hyperlink w:anchor="_Toc226732816" w:history="1">
+          <w:hyperlink w:anchor="_Toc226735789" w:history="1">
             <w:r>
               <w:rPr>
                 <w:rStyle w:val="Hyperlink"/>
@@ -224,7 +224,7 @@
                 <w:noProof/>
                 <w:webHidden/>
               </w:rPr>
-              <w:instrText xml:space="preserve"> PAGEREF _Toc226732816 \h </w:instrText>
+              <w:instrText xml:space="preserve"> PAGEREF _Toc226735789 \h </w:instrText>
             </w:r>
             <w:r>
               <w:rPr>
@@ -269,7 +269,7 @@
               <w:lang w:eastAsia="en-GB"/>
             </w:rPr>
           </w:pPr>
-          <w:hyperlink w:anchor="_Toc226732817" w:history="1">
+          <w:hyperlink w:anchor="_Toc226735790" w:history="1">
             <w:r>
               <w:rPr>
                 <w:rStyle w:val="Hyperlink"/>
@@ -297,7 +297,7 @@
                 <w:noProof/>
                 <w:webHidden/>
               </w:rPr>
-              <w:instrText xml:space="preserve"> PAGEREF _Toc226732817 \h </w:instrText>
+              <w:instrText xml:space="preserve"> PAGEREF _Toc226735790 \h </w:instrText>
             </w:r>
             <w:r>
               <w:rPr>
@@ -342,7 +342,7 @@
               <w:lang w:eastAsia="en-GB"/>
             </w:rPr>
           </w:pPr>
-          <w:hyperlink w:anchor="_Toc226732818" w:history="1">
+          <w:hyperlink w:anchor="_Toc226735791" w:history="1">
             <w:r>
               <w:rPr>
                 <w:rStyle w:val="Hyperlink"/>
@@ -370,7 +370,7 @@
                 <w:noProof/>
                 <w:webHidden/>
               </w:rPr>
-              <w:instrText xml:space="preserve"> PAGEREF _Toc226732818 \h </w:instrText>
+              <w:instrText xml:space="preserve"> PAGEREF _Toc226735791 \h </w:instrText>
             </w:r>
             <w:r>
               <w:rPr>
@@ -415,7 +415,7 @@
               <w:lang w:eastAsia="en-GB"/>
             </w:rPr>
           </w:pPr>
-          <w:hyperlink w:anchor="_Toc226732819" w:history="1">
+          <w:hyperlink w:anchor="_Toc226735792" w:history="1">
             <w:r>
               <w:rPr>
                 <w:rStyle w:val="Hyperlink"/>
@@ -443,7 +443,7 @@
                 <w:noProof/>
                 <w:webHidden/>
               </w:rPr>
-              <w:instrText xml:space="preserve"> PAGEREF _Toc226732819 \h </w:instrText>
+              <w:instrText xml:space="preserve"> PAGEREF _Toc226735792 \h </w:instrText>
             </w:r>
             <w:r>
               <w:rPr>
@@ -488,7 +488,7 @@
               <w:lang w:eastAsia="en-GB"/>
             </w:rPr>
           </w:pPr>
-          <w:hyperlink w:anchor="_Toc226732820" w:history="1">
+          <w:hyperlink w:anchor="_Toc226735793" w:history="1">
             <w:r>
               <w:rPr>
                 <w:rStyle w:val="Hyperlink"/>
@@ -516,7 +516,7 @@
                 <w:noProof/>
                 <w:webHidden/>
               </w:rPr>
-              <w:instrText xml:space="preserve"> PAGEREF _Toc226732820 \h </w:instrText>
+              <w:instrText xml:space="preserve"> PAGEREF _Toc226735793 \h </w:instrText>
             </w:r>
             <w:r>
               <w:rPr>
@@ -561,7 +561,7 @@
               <w:lang w:eastAsia="en-GB"/>
             </w:rPr>
           </w:pPr>
-          <w:hyperlink w:anchor="_Toc226732821" w:history="1">
+          <w:hyperlink w:anchor="_Toc226735794" w:history="1">
             <w:r>
               <w:rPr>
                 <w:rStyle w:val="Hyperlink"/>
@@ -589,7 +589,7 @@
                 <w:noProof/>
                 <w:webHidden/>
               </w:rPr>
-              <w:instrText xml:space="preserve"> PAGEREF _Toc226732821 \h </w:instrText>
+              <w:instrText xml:space="preserve"> PAGEREF _Toc226735794 \h </w:instrText>
             </w:r>
             <w:r>
               <w:rPr>
@@ -634,7 +634,7 @@
               <w:lang w:eastAsia="en-GB"/>
             </w:rPr>
           </w:pPr>
-          <w:hyperlink w:anchor="_Toc226732822" w:history="1">
+          <w:hyperlink w:anchor="_Toc226735795" w:history="1">
             <w:r>
               <w:rPr>
                 <w:rStyle w:val="Hyperlink"/>
@@ -662,7 +662,7 @@
                 <w:noProof/>
                 <w:webHidden/>
               </w:rPr>
-              <w:instrText xml:space="preserve"> PAGEREF _Toc226732822 \h </w:instrText>
+              <w:instrText xml:space="preserve"> PAGEREF _Toc226735795 \h </w:instrText>
             </w:r>
             <w:r>
               <w:rPr>
@@ -707,14 +707,14 @@
               <w:lang w:eastAsia="en-GB"/>
             </w:rPr>
           </w:pPr>
-          <w:hyperlink w:anchor="_Toc226732823" w:history="1">
+          <w:hyperlink w:anchor="_Toc226735796" w:history="1">
             <w:r>
               <w:rPr>
                 <w:rStyle w:val="Hyperlink"/>
                 <w:noProof/>
                 <w:lang w:val="en-US"/>
               </w:rPr>
-              <w:t>Frontend  challenge – RouteMap Componment</w:t>
+              <w:t>Frontend  challenge – RouteMap Component</w:t>
             </w:r>
             <w:r>
               <w:rPr>
@@ -735,7 +735,7 @@
                 <w:noProof/>
                 <w:webHidden/>
               </w:rPr>
-              <w:instrText xml:space="preserve"> PAGEREF _Toc226732823 \h </w:instrText>
+              <w:instrText xml:space="preserve"> PAGEREF _Toc226735796 \h </w:instrText>
             </w:r>
             <w:r>
               <w:rPr>
@@ -755,7 +755,7 @@
                 <w:noProof/>
                 <w:webHidden/>
               </w:rPr>
-              <w:t>8</w:t>
+              <w:t>11</w:t>
             </w:r>
             <w:r>
               <w:rPr>
@@ -780,7 +780,7 @@
               <w:lang w:eastAsia="en-GB"/>
             </w:rPr>
           </w:pPr>
-          <w:hyperlink w:anchor="_Toc226732824" w:history="1">
+          <w:hyperlink w:anchor="_Toc226735797" w:history="1">
             <w:r>
               <w:rPr>
                 <w:rStyle w:val="Hyperlink"/>
@@ -808,7 +808,7 @@
                 <w:noProof/>
                 <w:webHidden/>
               </w:rPr>
-              <w:instrText xml:space="preserve"> PAGEREF _Toc226732824 \h </w:instrText>
+              <w:instrText xml:space="preserve"> PAGEREF _Toc226735797 \h </w:instrText>
             </w:r>
             <w:r>
               <w:rPr>
@@ -828,7 +828,7 @@
                 <w:noProof/>
                 <w:webHidden/>
               </w:rPr>
-              <w:t>9</w:t>
+              <w:t>13</w:t>
             </w:r>
             <w:r>
               <w:rPr>
@@ -853,7 +853,7 @@
               <w:lang w:eastAsia="en-GB"/>
             </w:rPr>
           </w:pPr>
-          <w:hyperlink w:anchor="_Toc226732825" w:history="1">
+          <w:hyperlink w:anchor="_Toc226735798" w:history="1">
             <w:r>
               <w:rPr>
                 <w:rStyle w:val="Hyperlink"/>
@@ -881,7 +881,7 @@
                 <w:noProof/>
                 <w:webHidden/>
               </w:rPr>
-              <w:instrText xml:space="preserve"> PAGEREF _Toc226732825 \h </w:instrText>
+              <w:instrText xml:space="preserve"> PAGEREF _Toc226735798 \h </w:instrText>
             </w:r>
             <w:r>
               <w:rPr>
@@ -901,7 +901,7 @@
                 <w:noProof/>
                 <w:webHidden/>
               </w:rPr>
-              <w:t>9</w:t>
+              <w:t>13</w:t>
             </w:r>
             <w:r>
               <w:rPr>
@@ -926,7 +926,7 @@
               <w:lang w:eastAsia="en-GB"/>
             </w:rPr>
           </w:pPr>
-          <w:hyperlink w:anchor="_Toc226732826" w:history="1">
+          <w:hyperlink w:anchor="_Toc226735799" w:history="1">
             <w:r>
               <w:rPr>
                 <w:rStyle w:val="Hyperlink"/>
@@ -953,7 +953,7 @@
                 <w:noProof/>
                 <w:webHidden/>
               </w:rPr>
-              <w:instrText xml:space="preserve"> PAGEREF _Toc226732826 \h </w:instrText>
+              <w:instrText xml:space="preserve"> PAGEREF _Toc226735799 \h </w:instrText>
             </w:r>
             <w:r>
               <w:rPr>
@@ -973,7 +973,7 @@
                 <w:noProof/>
                 <w:webHidden/>
               </w:rPr>
-              <w:t>9</w:t>
+              <w:t>13</w:t>
             </w:r>
             <w:r>
               <w:rPr>
@@ -998,7 +998,7 @@
               <w:lang w:eastAsia="en-GB"/>
             </w:rPr>
           </w:pPr>
-          <w:hyperlink w:anchor="_Toc226732827" w:history="1">
+          <w:hyperlink w:anchor="_Toc226735800" w:history="1">
             <w:r>
               <w:rPr>
                 <w:rStyle w:val="Hyperlink"/>
@@ -1025,7 +1025,7 @@
                 <w:noProof/>
                 <w:webHidden/>
               </w:rPr>
-              <w:instrText xml:space="preserve"> PAGEREF _Toc226732827 \h </w:instrText>
+              <w:instrText xml:space="preserve"> PAGEREF _Toc226735800 \h </w:instrText>
             </w:r>
             <w:r>
               <w:rPr>
@@ -1045,7 +1045,7 @@
                 <w:noProof/>
                 <w:webHidden/>
               </w:rPr>
-              <w:t>9</w:t>
+              <w:t>13</w:t>
             </w:r>
             <w:r>
               <w:rPr>
@@ -1070,7 +1070,7 @@
               <w:lang w:eastAsia="en-GB"/>
             </w:rPr>
           </w:pPr>
-          <w:hyperlink w:anchor="_Toc226732828" w:history="1">
+          <w:hyperlink w:anchor="_Toc226735801" w:history="1">
             <w:r>
               <w:rPr>
                 <w:rStyle w:val="Hyperlink"/>
@@ -1097,7 +1097,7 @@
                 <w:noProof/>
                 <w:webHidden/>
               </w:rPr>
-              <w:instrText xml:space="preserve"> PAGEREF _Toc226732828 \h </w:instrText>
+              <w:instrText xml:space="preserve"> PAGEREF _Toc226735801 \h </w:instrText>
             </w:r>
             <w:r>
               <w:rPr>
@@ -1117,7 +1117,7 @@
                 <w:noProof/>
                 <w:webHidden/>
               </w:rPr>
-              <w:t>9</w:t>
+              <w:t>13</w:t>
             </w:r>
             <w:r>
               <w:rPr>
@@ -1160,7 +1160,7 @@
           <w:lang w:val="en-US"/>
         </w:rPr>
       </w:pPr>
-      <w:bookmarkStart w:id="0" w:name="_Toc226732815"/>
+      <w:bookmarkStart w:id="0" w:name="_Toc226735788"/>
       <w:r>
         <w:rPr>
           <w:lang w:val="en-US"/>
@@ -1187,49 +1187,7 @@
         <w:rPr>
           <w:lang w:val="en-US"/>
         </w:rPr>
-        <w:t xml:space="preserve">The purpose of this web </w:t>
-      </w:r>
-      <w:proofErr w:type="gramStart"/>
-      <w:r>
-        <w:rPr>
-          <w:lang w:val="en-US"/>
-        </w:rPr>
-        <w:t>app  was</w:t>
-      </w:r>
-      <w:proofErr w:type="gramEnd"/>
-      <w:r>
-        <w:rPr>
-          <w:lang w:val="en-US"/>
-        </w:rPr>
-        <w:t xml:space="preserve"> to allow end users to optimize a travel </w:t>
-      </w:r>
-      <w:proofErr w:type="gramStart"/>
-      <w:r>
-        <w:rPr>
-          <w:lang w:val="en-US"/>
-        </w:rPr>
-        <w:t>itinerary  for</w:t>
-      </w:r>
-      <w:proofErr w:type="gramEnd"/>
-      <w:r>
-        <w:rPr>
-          <w:lang w:val="en-US"/>
-        </w:rPr>
-        <w:t xml:space="preserve"> the FIFA World cup 2026 – which is going to be hosted between three </w:t>
-      </w:r>
-      <w:proofErr w:type="gramStart"/>
-      <w:r>
-        <w:rPr>
-          <w:lang w:val="en-US"/>
-        </w:rPr>
-        <w:t>countries;</w:t>
-      </w:r>
-      <w:proofErr w:type="gramEnd"/>
-      <w:r>
-        <w:rPr>
-          <w:lang w:val="en-US"/>
-        </w:rPr>
-        <w:t xml:space="preserve"> US, Mexica and Canada. System needed to incorporate game selection, route optimization and the budget calculation and comparison to the user allocated budget.  </w:t>
+        <w:t xml:space="preserve">The purpose of this web app  was to allow end users to optimize a travel itinerary  for the FIFA World cup 2026 – which is going to be hosted between three countries; US, Mexica and Canada. System needed to incorporate game selection, route optimization and the budget calculation and comparison to the user allocated budget.  </w:t>
       </w:r>
     </w:p>
     <w:p>
@@ -1246,7 +1204,6 @@
         <w:t xml:space="preserve">The idea of this project was to be able to add/modify </w:t>
       </w:r>
       <w:proofErr w:type="spellStart"/>
-      <w:proofErr w:type="gramStart"/>
       <w:r>
         <w:rPr>
           <w:lang w:val="en-US"/>
@@ -1254,26 +1211,11 @@
         <w:t>pre existing</w:t>
       </w:r>
       <w:proofErr w:type="spellEnd"/>
-      <w:proofErr w:type="gramEnd"/>
-      <w:r>
-        <w:rPr>
-          <w:lang w:val="en-US"/>
-        </w:rPr>
-        <w:t xml:space="preserve"> code by forking the project from the junior-challenge template repo and to be able to have a working solution for several challenges whilst ensuring code quality was respected and to be able to have </w:t>
-      </w:r>
-      <w:proofErr w:type="gramStart"/>
-      <w:r>
-        <w:rPr>
-          <w:lang w:val="en-US"/>
-        </w:rPr>
-        <w:t>a</w:t>
-      </w:r>
-      <w:proofErr w:type="gramEnd"/>
-      <w:r>
-        <w:rPr>
-          <w:lang w:val="en-US"/>
-        </w:rPr>
-        <w:t xml:space="preserve"> understanding of the project. Also to write/develop meaningful tests and documentation. </w:t>
+      <w:r>
+        <w:rPr>
+          <w:lang w:val="en-US"/>
+        </w:rPr>
+        <w:t xml:space="preserve"> code by forking the project from the junior-challenge template repo and to be able to have a working solution for several challenges whilst ensuring code quality was respected and to be able to have a understanding of the project. Also to write/develop meaningful tests and documentation. </w:t>
       </w:r>
     </w:p>
     <w:p>
@@ -1283,7 +1225,7 @@
           <w:lang w:val="en-US"/>
         </w:rPr>
       </w:pPr>
-      <w:bookmarkStart w:id="1" w:name="_Toc226732816"/>
+      <w:bookmarkStart w:id="1" w:name="_Toc226735789"/>
       <w:r>
         <w:rPr>
           <w:lang w:val="en-US"/>
@@ -1314,49 +1256,7 @@
         <w:rPr>
           <w:lang w:val="en-US"/>
         </w:rPr>
-        <w:t xml:space="preserve">Node.js with express was chosen as one of the advantages was because of the event driven architecture makes it well-structured for handling concurrent API requests efficiently whilst this project is not heavily I/O bound at scale the model simplifies handling operations without introducing unnecessary complexity.  As the frontend was developed using React + TypeScript which are both use JavaScript and by using Node.js the same core language is used </w:t>
-      </w:r>
-      <w:proofErr w:type="gramStart"/>
-      <w:r>
-        <w:rPr>
-          <w:lang w:val="en-US"/>
-        </w:rPr>
-        <w:t>throughout  the</w:t>
-      </w:r>
-      <w:proofErr w:type="gramEnd"/>
-      <w:r>
-        <w:rPr>
-          <w:lang w:val="en-US"/>
-        </w:rPr>
-        <w:t xml:space="preserve"> entire application and makes sharing of types and data structures easier.   If we compare it to Flash </w:t>
-      </w:r>
-      <w:proofErr w:type="gramStart"/>
-      <w:r>
-        <w:rPr>
-          <w:lang w:val="en-US"/>
-        </w:rPr>
-        <w:t>yes it is</w:t>
-      </w:r>
-      <w:proofErr w:type="gramEnd"/>
-      <w:r>
-        <w:rPr>
-          <w:lang w:val="en-US"/>
-        </w:rPr>
-        <w:t xml:space="preserve"> lightweight + </w:t>
-      </w:r>
-      <w:proofErr w:type="gramStart"/>
-      <w:r>
-        <w:rPr>
-          <w:lang w:val="en-US"/>
-        </w:rPr>
-        <w:t>flexible  but</w:t>
-      </w:r>
-      <w:proofErr w:type="gramEnd"/>
-      <w:r>
-        <w:rPr>
-          <w:lang w:val="en-US"/>
-        </w:rPr>
-        <w:t xml:space="preserve"> it lacks the structure provided by TypeScript – and especially for this project having consistent data models for example city, route and match are important thus by going with Node.js provided better </w:t>
+        <w:t xml:space="preserve">Node.js with express was chosen as one of the advantages was because of the event driven architecture makes it well-structured for handling concurrent API requests efficiently whilst this project is not heavily I/O bound at scale the model simplifies handling operations without introducing unnecessary complexity.  As the frontend was developed using React + TypeScript which are both use JavaScript and by using Node.js the same core language is used throughout  the entire application and makes sharing of types and data structures easier.   If we compare it to Flash yes it is lightweight + flexible  but it lacks the structure provided by TypeScript – and especially for this project having consistent data models for example city, route and match are important thus by going with Node.js provided better </w:t>
       </w:r>
       <w:proofErr w:type="spellStart"/>
       <w:r>
@@ -1373,7 +1273,6 @@
         <w:t xml:space="preserve">. If we compare it to Spring boot which is great for enterprise level features and strong type safety, it adds more configuration overhead and for a project of this size Node.js is more appropriate. And .NET also suffers the same as </w:t>
       </w:r>
       <w:proofErr w:type="spellStart"/>
-      <w:proofErr w:type="gramStart"/>
       <w:r>
         <w:rPr>
           <w:lang w:val="en-US"/>
@@ -1381,7 +1280,6 @@
         <w:t>Springboot</w:t>
       </w:r>
       <w:proofErr w:type="spellEnd"/>
-      <w:proofErr w:type="gramEnd"/>
       <w:r>
         <w:rPr>
           <w:lang w:val="en-US"/>
@@ -1396,7 +1294,7 @@
           <w:lang w:val="en-US"/>
         </w:rPr>
       </w:pPr>
-      <w:bookmarkStart w:id="2" w:name="_Toc226732817"/>
+      <w:bookmarkStart w:id="2" w:name="_Toc226735790"/>
       <w:r>
         <w:rPr>
           <w:lang w:val="en-US"/>
@@ -1418,7 +1316,7 @@
           <w:lang w:val="en-US"/>
         </w:rPr>
       </w:pPr>
-      <w:bookmarkStart w:id="3" w:name="_Toc226732818"/>
+      <w:bookmarkStart w:id="3" w:name="_Toc226735791"/>
       <w:r>
         <w:rPr>
           <w:lang w:val="en-US"/>
@@ -1443,21 +1341,7 @@
         <w:rPr>
           <w:lang w:val="en-US"/>
         </w:rPr>
-        <w:t xml:space="preserve">One of the key strengths </w:t>
-      </w:r>
-      <w:proofErr w:type="gramStart"/>
-      <w:r>
-        <w:rPr>
-          <w:lang w:val="en-US"/>
-        </w:rPr>
-        <w:t>of  GET</w:t>
-      </w:r>
-      <w:proofErr w:type="gramEnd"/>
-      <w:r>
-        <w:rPr>
-          <w:lang w:val="en-US"/>
-        </w:rPr>
-        <w:t xml:space="preserve"> /</w:t>
+        <w:t>One of the key strengths of  GET /</w:t>
       </w:r>
       <w:proofErr w:type="spellStart"/>
       <w:r>
@@ -1471,21 +1355,7 @@
         <w:rPr>
           <w:lang w:val="en-US"/>
         </w:rPr>
-        <w:t xml:space="preserve"> /</w:t>
-      </w:r>
-      <w:proofErr w:type="gramStart"/>
-      <w:r>
-        <w:rPr>
-          <w:lang w:val="en-US"/>
-        </w:rPr>
-        <w:t>cities  is</w:t>
-      </w:r>
-      <w:proofErr w:type="gramEnd"/>
-      <w:r>
-        <w:rPr>
-          <w:lang w:val="en-US"/>
-        </w:rPr>
-        <w:t xml:space="preserve"> </w:t>
+        <w:t xml:space="preserve"> /cities  is </w:t>
       </w:r>
       <w:proofErr w:type="spellStart"/>
       <w:r>
@@ -1526,62 +1396,20 @@
         <w:rPr>
           <w:lang w:val="en-US"/>
         </w:rPr>
-        <w:t xml:space="preserve">This endpoint could be refactored further by adding a service layer as the route currently directly with the model layer so, if a layer was introduced this would help </w:t>
-      </w:r>
-      <w:proofErr w:type="gramStart"/>
-      <w:r>
-        <w:rPr>
-          <w:lang w:val="en-US"/>
-        </w:rPr>
-        <w:t>encapsulate  business</w:t>
-      </w:r>
-      <w:proofErr w:type="gramEnd"/>
-      <w:r>
-        <w:rPr>
-          <w:lang w:val="en-US"/>
-        </w:rPr>
-        <w:t xml:space="preserve"> logic and keep this route cleaner. Also, </w:t>
-      </w:r>
-      <w:proofErr w:type="gramStart"/>
-      <w:r>
-        <w:rPr>
-          <w:lang w:val="en-US"/>
-        </w:rPr>
-        <w:t>an</w:t>
-      </w:r>
-      <w:proofErr w:type="gramEnd"/>
-      <w:r>
-        <w:rPr>
-          <w:lang w:val="en-US"/>
-        </w:rPr>
-        <w:t xml:space="preserve"> centralized error middleware could be used to capture/handle errors instead of them being duplicated in each route and ensure consistently throughout all endpoints.  </w:t>
-      </w:r>
-    </w:p>
-    <w:p>
-      <w:pPr>
-        <w:rPr>
-          <w:lang w:val="en-US"/>
-        </w:rPr>
-      </w:pPr>
-      <w:r>
-        <w:rPr>
-          <w:lang w:val="en-US"/>
-        </w:rPr>
-        <w:t xml:space="preserve">But </w:t>
-      </w:r>
-      <w:proofErr w:type="gramStart"/>
-      <w:r>
-        <w:rPr>
-          <w:lang w:val="en-US"/>
-        </w:rPr>
-        <w:t>at the moment</w:t>
-      </w:r>
-      <w:proofErr w:type="gramEnd"/>
-      <w:r>
-        <w:rPr>
-          <w:lang w:val="en-US"/>
-        </w:rPr>
-        <w:t xml:space="preserve"> it is suffice especially for the size of the system.  </w:t>
+        <w:t xml:space="preserve">This endpoint could be refactored further by adding a service layer as the route currently directly with the model layer so, if a layer was introduced this would help encapsulate  business logic and keep this route cleaner. Also, an centralized error middleware could be used to capture/handle errors instead of them being duplicated in each route and ensure consistently throughout all endpoints.  </w:t>
+      </w:r>
+    </w:p>
+    <w:p>
+      <w:pPr>
+        <w:rPr>
+          <w:lang w:val="en-US"/>
+        </w:rPr>
+      </w:pPr>
+      <w:r>
+        <w:rPr>
+          <w:lang w:val="en-US"/>
+        </w:rPr>
+        <w:t xml:space="preserve">But at the moment it is suffice especially for the size of the system.  </w:t>
       </w:r>
     </w:p>
     <w:p>
@@ -1693,7 +1521,7 @@
           <w:lang w:val="en-US"/>
         </w:rPr>
       </w:pPr>
-      <w:bookmarkStart w:id="4" w:name="_Toc226732819"/>
+      <w:bookmarkStart w:id="4" w:name="_Toc226735792"/>
       <w:r>
         <w:rPr>
           <w:lang w:val="en-US"/>
@@ -1776,7 +1604,6 @@
         <w:t xml:space="preserve">Using type safe extraction of query parameters is a positive as by checking </w:t>
       </w:r>
       <w:proofErr w:type="spellStart"/>
-      <w:proofErr w:type="gramStart"/>
       <w:r>
         <w:rPr>
           <w:lang w:val="en-US"/>
@@ -1784,7 +1611,6 @@
         <w:t>req.query</w:t>
       </w:r>
       <w:proofErr w:type="spellEnd"/>
-      <w:proofErr w:type="gramEnd"/>
       <w:r>
         <w:rPr>
           <w:lang w:val="en-US"/>
@@ -1792,7 +1618,6 @@
         <w:t xml:space="preserve"> + </w:t>
       </w:r>
       <w:proofErr w:type="spellStart"/>
-      <w:proofErr w:type="gramStart"/>
       <w:r>
         <w:rPr>
           <w:lang w:val="en-US"/>
@@ -1800,7 +1625,6 @@
         <w:t>req.query</w:t>
       </w:r>
       <w:proofErr w:type="spellEnd"/>
-      <w:proofErr w:type="gramEnd"/>
       <w:r>
         <w:rPr>
           <w:lang w:val="en-US"/>
@@ -1839,21 +1663,7 @@
         <w:rPr>
           <w:lang w:val="en-US"/>
         </w:rPr>
-        <w:t xml:space="preserve">/matches/:id endpoint retrieves a single resource using a path parameter which is good for RESTful conventions. – Includes appropriate validation to ensure </w:t>
-      </w:r>
-      <w:proofErr w:type="gramStart"/>
-      <w:r>
-        <w:rPr>
-          <w:lang w:val="en-US"/>
-        </w:rPr>
-        <w:t>an  ID</w:t>
-      </w:r>
-      <w:proofErr w:type="gramEnd"/>
-      <w:r>
-        <w:rPr>
-          <w:lang w:val="en-US"/>
-        </w:rPr>
-        <w:t xml:space="preserve"> is provided and returns a </w:t>
+        <w:t xml:space="preserve">/matches/:id endpoint retrieves a single resource using a path parameter which is good for RESTful conventions. – Includes appropriate validation to ensure an  ID is provided and returns a </w:t>
       </w:r>
       <w:r>
         <w:rPr>
@@ -1865,42 +1675,20 @@
         <w:rPr>
           <w:lang w:val="en-US"/>
         </w:rPr>
-        <w:t xml:space="preserve"> code if the requested match does not </w:t>
-      </w:r>
-      <w:proofErr w:type="gramStart"/>
-      <w:r>
-        <w:rPr>
-          <w:lang w:val="en-US"/>
-        </w:rPr>
-        <w:t>existed  again</w:t>
-      </w:r>
-      <w:proofErr w:type="gramEnd"/>
-      <w:r>
-        <w:rPr>
-          <w:lang w:val="en-US"/>
-        </w:rPr>
-        <w:t xml:space="preserve"> improving API reliability. </w:t>
-      </w:r>
-    </w:p>
-    <w:p>
-      <w:pPr>
-        <w:rPr>
-          <w:lang w:val="en-US"/>
-        </w:rPr>
-      </w:pPr>
-      <w:proofErr w:type="gramStart"/>
-      <w:r>
-        <w:rPr>
-          <w:lang w:val="en-US"/>
-        </w:rPr>
-        <w:t>Again</w:t>
-      </w:r>
-      <w:proofErr w:type="gramEnd"/>
-      <w:r>
-        <w:rPr>
-          <w:lang w:val="en-US"/>
-        </w:rPr>
-        <w:t xml:space="preserve"> using try-catch blocks alongside errors are logged whilst returning a generic message to the client thus not </w:t>
+        <w:t xml:space="preserve"> code if the requested match does not existed  again improving API reliability. </w:t>
+      </w:r>
+    </w:p>
+    <w:p>
+      <w:pPr>
+        <w:rPr>
+          <w:lang w:val="en-US"/>
+        </w:rPr>
+      </w:pPr>
+      <w:r>
+        <w:rPr>
+          <w:lang w:val="en-US"/>
+        </w:rPr>
+        <w:t xml:space="preserve">Again using try-catch blocks alongside errors are logged whilst returning a generic message to the client thus not </w:t>
       </w:r>
       <w:r>
         <w:rPr>
@@ -2128,26 +1916,12 @@
           <w:lang w:val="en-US"/>
         </w:rPr>
       </w:pPr>
-      <w:bookmarkStart w:id="5" w:name="_Toc226732820"/>
-      <w:r>
-        <w:rPr>
-          <w:lang w:val="en-US"/>
-        </w:rPr>
-        <w:t>Task #</w:t>
-      </w:r>
-      <w:proofErr w:type="gramStart"/>
-      <w:r>
-        <w:rPr>
-          <w:lang w:val="en-US"/>
-        </w:rPr>
-        <w:t>3  -</w:t>
-      </w:r>
-      <w:proofErr w:type="gramEnd"/>
-      <w:r>
-        <w:rPr>
-          <w:lang w:val="en-US"/>
-        </w:rPr>
-        <w:t xml:space="preserve"> Route Optimizations</w:t>
+      <w:bookmarkStart w:id="5" w:name="_Toc226735793"/>
+      <w:r>
+        <w:rPr>
+          <w:lang w:val="en-US"/>
+        </w:rPr>
+        <w:t>Task #3  - Route Optimizations</w:t>
       </w:r>
       <w:bookmarkEnd w:id="5"/>
       <w:r>
@@ -2195,21 +1969,7 @@
         <w:rPr>
           <w:lang w:val="en-US"/>
         </w:rPr>
-        <w:t xml:space="preserve">/ endpoint is responsible for transforming a set of user selected matches into an optimized travel route which </w:t>
-      </w:r>
-      <w:proofErr w:type="gramStart"/>
-      <w:r>
-        <w:rPr>
-          <w:lang w:val="en-US"/>
-        </w:rPr>
-        <w:t>takes into account</w:t>
-      </w:r>
-      <w:proofErr w:type="gramEnd"/>
-      <w:r>
-        <w:rPr>
-          <w:lang w:val="en-US"/>
-        </w:rPr>
-        <w:t xml:space="preserve"> distance between cities.  Strategy design pattern – </w:t>
+        <w:t xml:space="preserve">/ endpoint is responsible for transforming a set of user selected matches into an optimized travel route which takes into account distance between cities.  Strategy design pattern – </w:t>
       </w:r>
       <w:proofErr w:type="spellStart"/>
       <w:r>
@@ -2226,7 +1986,6 @@
         <w:t xml:space="preserve"> the optimization logic within a </w:t>
       </w:r>
       <w:proofErr w:type="spellStart"/>
-      <w:proofErr w:type="gramStart"/>
       <w:r>
         <w:rPr>
           <w:lang w:val="en-US"/>
@@ -2238,14 +1997,7 @@
         <w:rPr>
           <w:lang w:val="en-US"/>
         </w:rPr>
-        <w:t xml:space="preserve">  class</w:t>
-      </w:r>
-      <w:proofErr w:type="gramEnd"/>
-      <w:r>
-        <w:rPr>
-          <w:lang w:val="en-US"/>
-        </w:rPr>
-        <w:t xml:space="preserve"> – route handler remains clean and focused </w:t>
+        <w:t xml:space="preserve">  class – route handler remains clean and focused </w:t>
       </w:r>
       <w:proofErr w:type="spellStart"/>
       <w:r>
@@ -2322,35 +2074,7 @@
         <w:rPr>
           <w:lang w:val="en-US"/>
         </w:rPr>
-        <w:t xml:space="preserve"> city exists and the matches are retrieved alongside appropriate HTTP status code and feedback to the client with internal logging </w:t>
-      </w:r>
-      <w:proofErr w:type="gramStart"/>
-      <w:r>
-        <w:rPr>
-          <w:lang w:val="en-US"/>
-        </w:rPr>
-        <w:t>to</w:t>
-      </w:r>
-      <w:proofErr w:type="gramEnd"/>
-      <w:r>
-        <w:rPr>
-          <w:lang w:val="en-US"/>
-        </w:rPr>
-        <w:t xml:space="preserve">.  The endpoint has a clear structure of </w:t>
-      </w:r>
-      <w:proofErr w:type="gramStart"/>
-      <w:r>
-        <w:rPr>
-          <w:lang w:val="en-US"/>
-        </w:rPr>
-        <w:t>validate</w:t>
-      </w:r>
-      <w:proofErr w:type="gramEnd"/>
-      <w:r>
-        <w:rPr>
-          <w:lang w:val="en-US"/>
-        </w:rPr>
-        <w:t xml:space="preserve"> the input, fetch required data from models and to return the result. </w:t>
+        <w:t xml:space="preserve"> city exists and the matches are retrieved alongside appropriate HTTP status code and feedback to the client with internal logging to.  The endpoint has a clear structure of validate the input, fetch required data from models and to return the result. </w:t>
       </w:r>
     </w:p>
     <w:p>
@@ -2375,21 +2099,7 @@
         <w:rPr>
           <w:lang w:val="en-US"/>
         </w:rPr>
-        <w:t xml:space="preserve"> optimization </w:t>
-      </w:r>
-      <w:proofErr w:type="gramStart"/>
-      <w:r>
-        <w:rPr>
-          <w:lang w:val="en-US"/>
-        </w:rPr>
-        <w:t>is</w:t>
-      </w:r>
-      <w:proofErr w:type="gramEnd"/>
-      <w:r>
-        <w:rPr>
-          <w:lang w:val="en-US"/>
-        </w:rPr>
-        <w:t xml:space="preserve"> a </w:t>
+        <w:t xml:space="preserve"> optimization is a </w:t>
       </w:r>
       <w:r>
         <w:rPr>
@@ -2508,27 +2218,13 @@
           <w:lang w:val="en-US"/>
         </w:rPr>
       </w:pPr>
-      <w:bookmarkStart w:id="6" w:name="_Toc226732821"/>
+      <w:bookmarkStart w:id="6" w:name="_Toc226735794"/>
       <w:r>
         <w:rPr>
           <w:lang w:val="en-US"/>
         </w:rPr>
         <w:lastRenderedPageBreak/>
-        <w:t>Task #</w:t>
-      </w:r>
-      <w:proofErr w:type="gramStart"/>
-      <w:r>
-        <w:rPr>
-          <w:lang w:val="en-US"/>
-        </w:rPr>
-        <w:t>4  -</w:t>
-      </w:r>
-      <w:proofErr w:type="gramEnd"/>
-      <w:r>
-        <w:rPr>
-          <w:lang w:val="en-US"/>
-        </w:rPr>
-        <w:t xml:space="preserve"> Unit Tests for Nearest </w:t>
+        <w:t xml:space="preserve">Task #4  - Unit Tests for Nearest </w:t>
       </w:r>
       <w:r>
         <w:rPr>
@@ -2554,21 +2250,7 @@
         <w:rPr>
           <w:lang w:val="en-US"/>
         </w:rPr>
-        <w:t xml:space="preserve">The tests focus on core </w:t>
-      </w:r>
-      <w:proofErr w:type="gramStart"/>
-      <w:r>
-        <w:rPr>
-          <w:lang w:val="en-US"/>
-        </w:rPr>
-        <w:t>functionality  and</w:t>
-      </w:r>
-      <w:proofErr w:type="gramEnd"/>
-      <w:r>
-        <w:rPr>
-          <w:lang w:val="en-US"/>
-        </w:rPr>
-        <w:t xml:space="preserve"> key edge cases – ensuring that </w:t>
+        <w:t xml:space="preserve">The tests focus on core functionality  and key edge cases – ensuring that </w:t>
       </w:r>
       <w:proofErr w:type="spellStart"/>
       <w:r>
@@ -2595,21 +2277,7 @@
         <w:rPr>
           <w:lang w:val="en-US"/>
         </w:rPr>
-        <w:t xml:space="preserve">The use of clear test structure (arrange, act and assert – each </w:t>
-      </w:r>
-      <w:proofErr w:type="gramStart"/>
-      <w:r>
-        <w:rPr>
-          <w:lang w:val="en-US"/>
-        </w:rPr>
-        <w:t>test  explicitly</w:t>
-      </w:r>
-      <w:proofErr w:type="gramEnd"/>
-      <w:r>
-        <w:rPr>
-          <w:lang w:val="en-US"/>
-        </w:rPr>
-        <w:t xml:space="preserve"> sets up mock data – invokes the optimism method + verifies the expected output – improves readability + makes the intent of easy to understand. The use of mock data (cities + matches) is good as creating controlled test inputs – tests remain </w:t>
+        <w:t xml:space="preserve">The use of clear test structure (arrange, act and assert – each test  explicitly sets up mock data – invokes the optimism method + verifies the expected output – improves readability + makes the intent of easy to understand. The use of mock data (cities + matches) is good as creating controlled test inputs – tests remain </w:t>
       </w:r>
       <w:proofErr w:type="spellStart"/>
       <w:r>
@@ -2637,21 +2305,7 @@
         <w:rPr>
           <w:lang w:val="en-US"/>
         </w:rPr>
-        <w:t xml:space="preserve">Happy test is valuable as it verifies multiple aspects of the </w:t>
-      </w:r>
-      <w:proofErr w:type="gramStart"/>
-      <w:r>
-        <w:rPr>
-          <w:lang w:val="en-US"/>
-        </w:rPr>
-        <w:t>algorithm  at</w:t>
-      </w:r>
-      <w:proofErr w:type="gramEnd"/>
-      <w:r>
-        <w:rPr>
-          <w:lang w:val="en-US"/>
-        </w:rPr>
-        <w:t xml:space="preserve"> the one time. </w:t>
+        <w:t xml:space="preserve">Happy test is valuable as it verifies multiple aspects of the algorithm  at the one time. </w:t>
       </w:r>
     </w:p>
     <w:p>
@@ -2681,20 +2335,7 @@
           <w:lang w:val="en-US"/>
         </w:rPr>
         <w:tab/>
-      </w:r>
-      <w:proofErr w:type="gramStart"/>
-      <w:r>
-        <w:rPr>
-          <w:lang w:val="en-US"/>
-        </w:rPr>
-        <w:t>Total  distance</w:t>
-      </w:r>
-      <w:proofErr w:type="gramEnd"/>
-      <w:r>
-        <w:rPr>
-          <w:lang w:val="en-US"/>
-        </w:rPr>
-        <w:t xml:space="preserve"> is greater than zero </w:t>
+        <w:t xml:space="preserve">Total  distance is greater than zero </w:t>
       </w:r>
     </w:p>
     <w:p>
@@ -2752,21 +2393,7 @@
         <w:rPr>
           <w:lang w:val="en-US"/>
         </w:rPr>
-        <w:t xml:space="preserve">Inclusion of edge case tests strengths it – testing an empty </w:t>
-      </w:r>
-      <w:proofErr w:type="gramStart"/>
-      <w:r>
-        <w:rPr>
-          <w:lang w:val="en-US"/>
-        </w:rPr>
-        <w:t>matches</w:t>
-      </w:r>
-      <w:proofErr w:type="gramEnd"/>
-      <w:r>
-        <w:rPr>
-          <w:lang w:val="en-US"/>
-        </w:rPr>
-        <w:t xml:space="preserve"> array ensures </w:t>
+        <w:t xml:space="preserve">Inclusion of edge case tests strengths it – testing an empty matches array ensures </w:t>
       </w:r>
       <w:proofErr w:type="spellStart"/>
       <w:r>
@@ -2780,126 +2407,90 @@
         <w:rPr>
           <w:lang w:val="en-US"/>
         </w:rPr>
+        <w:t xml:space="preserve"> function  handles of input gracefully and testing a single match verifies no unnecessary distance calculations are performed. </w:t>
+      </w:r>
+    </w:p>
+    <w:p>
+      <w:pPr>
+        <w:rPr>
+          <w:lang w:val="en-US"/>
+        </w:rPr>
+      </w:pPr>
+      <w:r>
+        <w:rPr>
+          <w:lang w:val="en-US"/>
+        </w:rPr>
+        <w:t xml:space="preserve">The use of </w:t>
+      </w:r>
+      <w:proofErr w:type="spellStart"/>
+      <w:r>
+        <w:rPr>
+          <w:lang w:val="en-US"/>
+        </w:rPr>
+        <w:t>beforeEach</w:t>
+      </w:r>
+      <w:proofErr w:type="spellEnd"/>
+      <w:r>
+        <w:rPr>
+          <w:lang w:val="en-US"/>
+        </w:rPr>
+        <w:t xml:space="preserve">() to reset the strategy instance is also good practice, ensuring test isolation + preventing shared state between tests. </w:t>
+      </w:r>
+    </w:p>
+    <w:p>
+      <w:pPr>
+        <w:rPr>
+          <w:lang w:val="en-US"/>
+        </w:rPr>
+      </w:pPr>
+      <w:r>
+        <w:rPr>
+          <w:lang w:val="en-US"/>
+        </w:rPr>
+        <w:t xml:space="preserve">Additional tests could include missing countries scenario – test a route that does not include all required countries + </w:t>
+      </w:r>
+      <w:r>
+        <w:rPr>
+          <w:lang w:val="en-US"/>
+        </w:rPr>
+        <w:t xml:space="preserve">verify that feasible is false + </w:t>
+      </w:r>
+      <w:proofErr w:type="spellStart"/>
+      <w:r>
+        <w:rPr>
+          <w:lang w:val="en-US"/>
+        </w:rPr>
+        <w:t>missingCountirs</w:t>
+      </w:r>
+      <w:proofErr w:type="spellEnd"/>
+      <w:r>
+        <w:rPr>
+          <w:lang w:val="en-US"/>
+        </w:rPr>
+        <w:t xml:space="preserve"> is populated. Another test could be minimum matches constraint – verify that routes with fewer than required number of matches are marked as not feasible.  Another check could be distance accuracy check and another one for invalid data handling and to perform a test with a large dataset. </w:t>
+      </w:r>
+    </w:p>
+    <w:p>
+      <w:pPr>
+        <w:pStyle w:val="Heading2"/>
+        <w:rPr>
+          <w:lang w:val="en-US"/>
+        </w:rPr>
+      </w:pPr>
+      <w:bookmarkStart w:id="7" w:name="_Toc226735795"/>
+      <w:r>
+        <w:rPr>
+          <w:lang w:val="en-US"/>
+        </w:rPr>
+        <w:t>Task #5 calculate cost and unit tests</w:t>
+      </w:r>
+      <w:bookmarkEnd w:id="7"/>
+      <w:r>
+        <w:rPr>
+          <w:lang w:val="en-US"/>
+        </w:rPr>
         <w:t xml:space="preserve"> </w:t>
       </w:r>
-      <w:proofErr w:type="gramStart"/>
-      <w:r>
-        <w:rPr>
-          <w:lang w:val="en-US"/>
-        </w:rPr>
-        <w:t>function  handles</w:t>
-      </w:r>
-      <w:proofErr w:type="gramEnd"/>
-      <w:r>
-        <w:rPr>
-          <w:lang w:val="en-US"/>
-        </w:rPr>
-        <w:t xml:space="preserve"> of input gracefully and testing a single match verifies no unnecessary distance calculations are performed. </w:t>
-      </w:r>
-    </w:p>
-    <w:p>
-      <w:pPr>
-        <w:rPr>
-          <w:lang w:val="en-US"/>
-        </w:rPr>
-      </w:pPr>
-      <w:r>
-        <w:rPr>
-          <w:lang w:val="en-US"/>
-        </w:rPr>
-        <w:t xml:space="preserve">The use of </w:t>
-      </w:r>
-      <w:proofErr w:type="spellStart"/>
-      <w:proofErr w:type="gramStart"/>
-      <w:r>
-        <w:rPr>
-          <w:lang w:val="en-US"/>
-        </w:rPr>
-        <w:t>beforeEach</w:t>
-      </w:r>
-      <w:proofErr w:type="spellEnd"/>
-      <w:r>
-        <w:rPr>
-          <w:lang w:val="en-US"/>
-        </w:rPr>
-        <w:t>(</w:t>
-      </w:r>
-      <w:proofErr w:type="gramEnd"/>
-      <w:r>
-        <w:rPr>
-          <w:lang w:val="en-US"/>
-        </w:rPr>
-        <w:t xml:space="preserve">) to reset the strategy instance is also good practice, ensuring test isolation + preventing shared state between tests. </w:t>
-      </w:r>
-    </w:p>
-    <w:p>
-      <w:pPr>
-        <w:rPr>
-          <w:lang w:val="en-US"/>
-        </w:rPr>
-      </w:pPr>
-      <w:r>
-        <w:rPr>
-          <w:lang w:val="en-US"/>
-        </w:rPr>
-        <w:t xml:space="preserve">Additional tests could include missing countries scenario – test a route that does not include all required countries + </w:t>
-      </w:r>
-      <w:r>
-        <w:rPr>
-          <w:lang w:val="en-US"/>
-        </w:rPr>
-        <w:t xml:space="preserve">verify that feasible is false + </w:t>
-      </w:r>
-      <w:proofErr w:type="spellStart"/>
-      <w:r>
-        <w:rPr>
-          <w:lang w:val="en-US"/>
-        </w:rPr>
-        <w:t>missingCountirs</w:t>
-      </w:r>
-      <w:proofErr w:type="spellEnd"/>
-      <w:r>
-        <w:rPr>
-          <w:lang w:val="en-US"/>
-        </w:rPr>
-        <w:t xml:space="preserve"> is populated. Another test could be minimum matches constraint – verify that routes with fewer than required number of matches are marked as not feasible.  Another check could be distance accuracy check and another one for invalid data handling and to perform a test with a large dataset. </w:t>
-      </w:r>
-    </w:p>
-    <w:p>
-      <w:pPr>
-        <w:pStyle w:val="Heading2"/>
-        <w:rPr>
-          <w:lang w:val="en-US"/>
-        </w:rPr>
-      </w:pPr>
-      <w:bookmarkStart w:id="7" w:name="_Toc226732822"/>
-      <w:r>
-        <w:rPr>
-          <w:lang w:val="en-US"/>
-        </w:rPr>
-        <w:t xml:space="preserve">Task #5 </w:t>
-      </w:r>
-      <w:proofErr w:type="gramStart"/>
-      <w:r>
-        <w:rPr>
-          <w:lang w:val="en-US"/>
-        </w:rPr>
-        <w:t>calculate</w:t>
-      </w:r>
-      <w:proofErr w:type="gramEnd"/>
-      <w:r>
-        <w:rPr>
-          <w:lang w:val="en-US"/>
-        </w:rPr>
-        <w:t xml:space="preserve"> cost and unit tests</w:t>
-      </w:r>
-      <w:bookmarkEnd w:id="7"/>
-      <w:r>
-        <w:rPr>
-          <w:lang w:val="en-US"/>
-        </w:rPr>
-        <w:t xml:space="preserve"> </w:t>
-      </w:r>
     </w:p>
     <w:p>
       <w:pPr>
@@ -2926,77 +2517,7 @@
         <w:rPr>
           <w:lang w:val="en-US"/>
         </w:rPr>
-        <w:t xml:space="preserve">/route/budget handles </w:t>
-      </w:r>
-      <w:proofErr w:type="gramStart"/>
-      <w:r>
-        <w:rPr>
-          <w:lang w:val="en-US"/>
-        </w:rPr>
-        <w:t>cost  calculation</w:t>
-      </w:r>
-      <w:proofErr w:type="gramEnd"/>
-      <w:r>
-        <w:rPr>
-          <w:lang w:val="en-US"/>
-        </w:rPr>
-        <w:t xml:space="preserve"> and to determine whether a </w:t>
-      </w:r>
-      <w:proofErr w:type="gramStart"/>
-      <w:r>
-        <w:rPr>
-          <w:lang w:val="en-US"/>
-        </w:rPr>
-        <w:t>user’s  selected</w:t>
-      </w:r>
-      <w:proofErr w:type="gramEnd"/>
-      <w:r>
-        <w:rPr>
-          <w:lang w:val="en-US"/>
-        </w:rPr>
-        <w:t xml:space="preserve"> </w:t>
-      </w:r>
-      <w:proofErr w:type="gramStart"/>
-      <w:r>
-        <w:rPr>
-          <w:lang w:val="en-US"/>
-        </w:rPr>
-        <w:t>users</w:t>
-      </w:r>
-      <w:proofErr w:type="gramEnd"/>
-      <w:r>
-        <w:rPr>
-          <w:lang w:val="en-US"/>
-        </w:rPr>
-        <w:t xml:space="preserve"> itinerary is feasible within a budget.  </w:t>
-      </w:r>
-      <w:proofErr w:type="gramStart"/>
-      <w:r>
-        <w:rPr>
-          <w:lang w:val="en-US"/>
-        </w:rPr>
-        <w:t>Again</w:t>
-      </w:r>
-      <w:proofErr w:type="gramEnd"/>
-      <w:r>
-        <w:rPr>
-          <w:lang w:val="en-US"/>
-        </w:rPr>
-        <w:t xml:space="preserve"> this endpoint is well structured to follow input validation, get data from models, cost calculation (flights, tickets) and constraint validation and finally the response construction. </w:t>
-      </w:r>
-      <w:proofErr w:type="gramStart"/>
-      <w:r>
-        <w:rPr>
-          <w:lang w:val="en-US"/>
-        </w:rPr>
-        <w:t>Also</w:t>
-      </w:r>
-      <w:proofErr w:type="gramEnd"/>
-      <w:r>
-        <w:rPr>
-          <w:lang w:val="en-US"/>
-        </w:rPr>
-        <w:t xml:space="preserve"> demonstrates defensive programming as it validates that matched is a </w:t>
+        <w:t xml:space="preserve">/route/budget handles cost  calculation and to determine whether a user’s  selected users itinerary is feasible within a budget.  Again this endpoint is well structured to follow input validation, get data from models, cost calculation (flights, tickets) and constraint validation and finally the response construction. Also demonstrates defensive programming as it validates that matched is a </w:t>
       </w:r>
       <w:r>
         <w:rPr>
@@ -3022,77 +2543,19 @@
         <w:rPr>
           <w:lang w:val="en-US"/>
         </w:rPr>
-        <w:t xml:space="preserve"> + budget </w:t>
-      </w:r>
-      <w:proofErr w:type="gramStart"/>
-      <w:r>
-        <w:rPr>
-          <w:lang w:val="en-US"/>
-        </w:rPr>
-        <w:t>are</w:t>
-      </w:r>
-      <w:proofErr w:type="gramEnd"/>
-      <w:r>
-        <w:rPr>
-          <w:lang w:val="en-US"/>
-        </w:rPr>
-        <w:t xml:space="preserve"> the correct type and the </w:t>
-      </w:r>
-      <w:proofErr w:type="gramStart"/>
+        <w:t xml:space="preserve"> + budget are the correct type and the </w:t>
+      </w:r>
       <w:r>
         <w:rPr>
           <w:lang w:val="en-US"/>
         </w:rPr>
         <w:t>origin</w:t>
       </w:r>
-      <w:proofErr w:type="gramEnd"/>
-      <w:r>
-        <w:rPr>
-          <w:lang w:val="en-US"/>
-        </w:rPr>
-        <w:t xml:space="preserve"> city exists and matches are successfully retrieved. </w:t>
-      </w:r>
-      <w:proofErr w:type="gramStart"/>
-      <w:r>
-        <w:rPr>
-          <w:lang w:val="en-US"/>
-        </w:rPr>
-        <w:t>Likewise</w:t>
-      </w:r>
-      <w:proofErr w:type="gramEnd"/>
-      <w:r>
-        <w:rPr>
-          <w:lang w:val="en-US"/>
-        </w:rPr>
-        <w:t xml:space="preserve"> HTTP status codes are </w:t>
-      </w:r>
-      <w:proofErr w:type="gramStart"/>
-      <w:r>
-        <w:rPr>
-          <w:lang w:val="en-US"/>
-        </w:rPr>
-        <w:t>retuned .</w:t>
-      </w:r>
-      <w:proofErr w:type="gramEnd"/>
-      <w:r>
-        <w:rPr>
-          <w:lang w:val="en-US"/>
-        </w:rPr>
-        <w:t xml:space="preserve">  The use of Map for flight lookup is efficient reducing the time complexity of retrieving flight prices from O(n) to </w:t>
-      </w:r>
-      <w:proofErr w:type="gramStart"/>
-      <w:r>
-        <w:rPr>
-          <w:lang w:val="en-US"/>
-        </w:rPr>
-        <w:t>O(</w:t>
-      </w:r>
-      <w:proofErr w:type="gramEnd"/>
-      <w:r>
-        <w:rPr>
-          <w:lang w:val="en-US"/>
-        </w:rPr>
-        <w:t>1)</w:t>
+      <w:r>
+        <w:rPr>
+          <w:lang w:val="en-US"/>
+        </w:rPr>
+        <w:t xml:space="preserve"> city exists and matches are successfully retrieved. Likewise HTTP status codes are retuned .  The use of Map for flight lookup is efficient reducing the time complexity of retrieving flight prices from O(n) to O(1)</w:t>
       </w:r>
       <w:r>
         <w:rPr>
@@ -3104,69 +2567,13 @@
         <w:rPr>
           <w:lang w:val="en-US"/>
         </w:rPr>
-        <w:t xml:space="preserve"> handles business logic of that the end user </w:t>
-      </w:r>
-      <w:proofErr w:type="gramStart"/>
-      <w:r>
-        <w:rPr>
-          <w:lang w:val="en-US"/>
-        </w:rPr>
-        <w:t>has to</w:t>
-      </w:r>
-      <w:proofErr w:type="gramEnd"/>
-      <w:r>
-        <w:rPr>
-          <w:lang w:val="en-US"/>
-        </w:rPr>
-        <w:t xml:space="preserve"> visit all required countries and determine whether the cost is within budget and generating suggestions when </w:t>
-      </w:r>
-      <w:proofErr w:type="gramStart"/>
-      <w:r>
-        <w:rPr>
-          <w:lang w:val="en-US"/>
-        </w:rPr>
-        <w:t>constrains</w:t>
-      </w:r>
-      <w:proofErr w:type="gramEnd"/>
-      <w:r>
-        <w:rPr>
-          <w:lang w:val="en-US"/>
-        </w:rPr>
-        <w:t xml:space="preserve"> are met. </w:t>
-      </w:r>
-      <w:r>
-        <w:rPr>
-          <w:lang w:val="en-US"/>
-        </w:rPr>
-        <w:t xml:space="preserve"> This endpoint could be refactored by handling multi </w:t>
-      </w:r>
-      <w:proofErr w:type="gramStart"/>
-      <w:r>
-        <w:rPr>
-          <w:lang w:val="en-US"/>
-        </w:rPr>
-        <w:t>accusation</w:t>
-      </w:r>
-      <w:proofErr w:type="gramEnd"/>
-      <w:r>
-        <w:rPr>
-          <w:lang w:val="en-US"/>
-        </w:rPr>
-        <w:t xml:space="preserve"> as the current implementation assumes one night per match </w:t>
-      </w:r>
-      <w:proofErr w:type="gramStart"/>
-      <w:r>
-        <w:rPr>
-          <w:lang w:val="en-US"/>
-        </w:rPr>
-        <w:t>which  better</w:t>
-      </w:r>
-      <w:proofErr w:type="gramEnd"/>
-      <w:r>
-        <w:rPr>
-          <w:lang w:val="en-US"/>
-        </w:rPr>
-        <w:t xml:space="preserve"> approach would calculate nights based on the difference between match dates. </w:t>
+        <w:t xml:space="preserve"> handles business logic of that the end user has to visit all required countries and determine whether the cost is within budget and generating suggestions when constrains are met. </w:t>
+      </w:r>
+      <w:r>
+        <w:rPr>
+          <w:lang w:val="en-US"/>
+        </w:rPr>
+        <w:t xml:space="preserve"> This endpoint could be refactored by handling multi accusation as the current implementation assumes one night per match which  better approach would calculate nights based on the difference between match dates. </w:t>
       </w:r>
       <w:r>
         <w:rPr>
@@ -3197,7 +2604,6 @@
         </w:rPr>
       </w:pPr>
       <w:proofErr w:type="spellStart"/>
-      <w:proofErr w:type="gramStart"/>
       <w:r>
         <w:rPr>
           <w:rFonts w:ascii="Consolas" w:eastAsia="Times New Roman" w:hAnsi="Consolas" w:cs="Times New Roman"/>
@@ -3247,7 +2653,6 @@
         </w:rPr>
         <w:t>(</w:t>
       </w:r>
-      <w:proofErr w:type="gramEnd"/>
       <w:r>
         <w:rPr>
           <w:rFonts w:ascii="Consolas" w:eastAsia="Times New Roman" w:hAnsi="Consolas" w:cs="Times New Roman"/>
@@ -3452,138 +2857,109 @@
           <w:lang w:eastAsia="en-GB"/>
           <w14:ligatures w14:val="none"/>
         </w:rPr>
+        <w:t xml:space="preserve"> { </w:t>
+      </w:r>
+      <w:proofErr w:type="spellStart"/>
+      <w:r>
+        <w:rPr>
+          <w:rFonts w:ascii="Consolas" w:eastAsia="Times New Roman" w:hAnsi="Consolas" w:cs="Times New Roman"/>
+          <w:color w:val="E5C07B"/>
+          <w:kern w:val="0"/>
+          <w:sz w:val="16"/>
+          <w:szCs w:val="16"/>
+          <w:lang w:eastAsia="en-GB"/>
+          <w14:ligatures w14:val="none"/>
+        </w:rPr>
+        <w:t>matchIds</w:t>
+      </w:r>
+      <w:proofErr w:type="spellEnd"/>
+      <w:r>
+        <w:rPr>
+          <w:rFonts w:ascii="Consolas" w:eastAsia="Times New Roman" w:hAnsi="Consolas" w:cs="Times New Roman"/>
+          <w:color w:val="BEA6A6"/>
+          <w:kern w:val="0"/>
+          <w:sz w:val="16"/>
+          <w:szCs w:val="16"/>
+          <w:lang w:eastAsia="en-GB"/>
+          <w14:ligatures w14:val="none"/>
+        </w:rPr>
+        <w:t xml:space="preserve">, </w:t>
+      </w:r>
+      <w:proofErr w:type="spellStart"/>
+      <w:r>
+        <w:rPr>
+          <w:rFonts w:ascii="Consolas" w:eastAsia="Times New Roman" w:hAnsi="Consolas" w:cs="Times New Roman"/>
+          <w:color w:val="E5C07B"/>
+          <w:kern w:val="0"/>
+          <w:sz w:val="16"/>
+          <w:szCs w:val="16"/>
+          <w:lang w:eastAsia="en-GB"/>
+          <w14:ligatures w14:val="none"/>
+        </w:rPr>
+        <w:t>originCityId</w:t>
+      </w:r>
+      <w:proofErr w:type="spellEnd"/>
+      <w:r>
+        <w:rPr>
+          <w:rFonts w:ascii="Consolas" w:eastAsia="Times New Roman" w:hAnsi="Consolas" w:cs="Times New Roman"/>
+          <w:color w:val="BEA6A6"/>
+          <w:kern w:val="0"/>
+          <w:sz w:val="16"/>
+          <w:szCs w:val="16"/>
+          <w:lang w:eastAsia="en-GB"/>
+          <w14:ligatures w14:val="none"/>
+        </w:rPr>
+        <w:t xml:space="preserve">, </w:t>
+      </w:r>
+      <w:r>
+        <w:rPr>
+          <w:rFonts w:ascii="Consolas" w:eastAsia="Times New Roman" w:hAnsi="Consolas" w:cs="Times New Roman"/>
+          <w:color w:val="E5C07B"/>
+          <w:kern w:val="0"/>
+          <w:sz w:val="16"/>
+          <w:szCs w:val="16"/>
+          <w:lang w:eastAsia="en-GB"/>
+          <w14:ligatures w14:val="none"/>
+        </w:rPr>
+        <w:t>budget</w:t>
+      </w:r>
+      <w:r>
+        <w:rPr>
+          <w:rFonts w:ascii="Consolas" w:eastAsia="Times New Roman" w:hAnsi="Consolas" w:cs="Times New Roman"/>
+          <w:color w:val="BEA6A6"/>
+          <w:kern w:val="0"/>
+          <w:sz w:val="16"/>
+          <w:szCs w:val="16"/>
+          <w:lang w:eastAsia="en-GB"/>
+          <w14:ligatures w14:val="none"/>
+        </w:rPr>
+        <w:t xml:space="preserve"> } </w:t>
+      </w:r>
+      <w:r>
+        <w:rPr>
+          <w:rFonts w:ascii="Consolas" w:eastAsia="Times New Roman" w:hAnsi="Consolas" w:cs="Times New Roman"/>
+          <w:color w:val="56B6C2"/>
+          <w:kern w:val="0"/>
+          <w:sz w:val="16"/>
+          <w:szCs w:val="16"/>
+          <w:lang w:eastAsia="en-GB"/>
+          <w14:ligatures w14:val="none"/>
+        </w:rPr>
+        <w:t>=</w:t>
+      </w:r>
+      <w:r>
+        <w:rPr>
+          <w:rFonts w:ascii="Consolas" w:eastAsia="Times New Roman" w:hAnsi="Consolas" w:cs="Times New Roman"/>
+          <w:color w:val="BEA6A6"/>
+          <w:kern w:val="0"/>
+          <w:sz w:val="16"/>
+          <w:szCs w:val="16"/>
+          <w:lang w:eastAsia="en-GB"/>
+          <w14:ligatures w14:val="none"/>
+        </w:rPr>
         <w:t xml:space="preserve"> </w:t>
       </w:r>
-      <w:proofErr w:type="gramStart"/>
-      <w:r>
-        <w:rPr>
-          <w:rFonts w:ascii="Consolas" w:eastAsia="Times New Roman" w:hAnsi="Consolas" w:cs="Times New Roman"/>
-          <w:color w:val="BEA6A6"/>
-          <w:kern w:val="0"/>
-          <w:sz w:val="16"/>
-          <w:szCs w:val="16"/>
-          <w:lang w:eastAsia="en-GB"/>
-          <w14:ligatures w14:val="none"/>
-        </w:rPr>
-        <w:t xml:space="preserve">{ </w:t>
-      </w:r>
-      <w:proofErr w:type="spellStart"/>
-      <w:r>
-        <w:rPr>
-          <w:rFonts w:ascii="Consolas" w:eastAsia="Times New Roman" w:hAnsi="Consolas" w:cs="Times New Roman"/>
-          <w:color w:val="E5C07B"/>
-          <w:kern w:val="0"/>
-          <w:sz w:val="16"/>
-          <w:szCs w:val="16"/>
-          <w:lang w:eastAsia="en-GB"/>
-          <w14:ligatures w14:val="none"/>
-        </w:rPr>
-        <w:t>matchIds</w:t>
-      </w:r>
-      <w:proofErr w:type="spellEnd"/>
-      <w:proofErr w:type="gramEnd"/>
-      <w:r>
-        <w:rPr>
-          <w:rFonts w:ascii="Consolas" w:eastAsia="Times New Roman" w:hAnsi="Consolas" w:cs="Times New Roman"/>
-          <w:color w:val="BEA6A6"/>
-          <w:kern w:val="0"/>
-          <w:sz w:val="16"/>
-          <w:szCs w:val="16"/>
-          <w:lang w:eastAsia="en-GB"/>
-          <w14:ligatures w14:val="none"/>
-        </w:rPr>
-        <w:t xml:space="preserve">, </w:t>
-      </w:r>
-      <w:proofErr w:type="spellStart"/>
-      <w:r>
-        <w:rPr>
-          <w:rFonts w:ascii="Consolas" w:eastAsia="Times New Roman" w:hAnsi="Consolas" w:cs="Times New Roman"/>
-          <w:color w:val="E5C07B"/>
-          <w:kern w:val="0"/>
-          <w:sz w:val="16"/>
-          <w:szCs w:val="16"/>
-          <w:lang w:eastAsia="en-GB"/>
-          <w14:ligatures w14:val="none"/>
-        </w:rPr>
-        <w:t>originCityId</w:t>
-      </w:r>
-      <w:proofErr w:type="spellEnd"/>
-      <w:r>
-        <w:rPr>
-          <w:rFonts w:ascii="Consolas" w:eastAsia="Times New Roman" w:hAnsi="Consolas" w:cs="Times New Roman"/>
-          <w:color w:val="BEA6A6"/>
-          <w:kern w:val="0"/>
-          <w:sz w:val="16"/>
-          <w:szCs w:val="16"/>
-          <w:lang w:eastAsia="en-GB"/>
-          <w14:ligatures w14:val="none"/>
-        </w:rPr>
-        <w:t xml:space="preserve">, </w:t>
-      </w:r>
-      <w:proofErr w:type="gramStart"/>
-      <w:r>
-        <w:rPr>
-          <w:rFonts w:ascii="Consolas" w:eastAsia="Times New Roman" w:hAnsi="Consolas" w:cs="Times New Roman"/>
-          <w:color w:val="E5C07B"/>
-          <w:kern w:val="0"/>
-          <w:sz w:val="16"/>
-          <w:szCs w:val="16"/>
-          <w:lang w:eastAsia="en-GB"/>
-          <w14:ligatures w14:val="none"/>
-        </w:rPr>
-        <w:t>budget</w:t>
-      </w:r>
-      <w:r>
-        <w:rPr>
-          <w:rFonts w:ascii="Consolas" w:eastAsia="Times New Roman" w:hAnsi="Consolas" w:cs="Times New Roman"/>
-          <w:color w:val="BEA6A6"/>
-          <w:kern w:val="0"/>
-          <w:sz w:val="16"/>
-          <w:szCs w:val="16"/>
-          <w:lang w:eastAsia="en-GB"/>
-          <w14:ligatures w14:val="none"/>
-        </w:rPr>
-        <w:t xml:space="preserve"> }</w:t>
-      </w:r>
-      <w:proofErr w:type="gramEnd"/>
-      <w:r>
-        <w:rPr>
-          <w:rFonts w:ascii="Consolas" w:eastAsia="Times New Roman" w:hAnsi="Consolas" w:cs="Times New Roman"/>
-          <w:color w:val="BEA6A6"/>
-          <w:kern w:val="0"/>
-          <w:sz w:val="16"/>
-          <w:szCs w:val="16"/>
-          <w:lang w:eastAsia="en-GB"/>
-          <w14:ligatures w14:val="none"/>
-        </w:rPr>
-        <w:t xml:space="preserve"> </w:t>
-      </w:r>
-      <w:r>
-        <w:rPr>
-          <w:rFonts w:ascii="Consolas" w:eastAsia="Times New Roman" w:hAnsi="Consolas" w:cs="Times New Roman"/>
-          <w:color w:val="56B6C2"/>
-          <w:kern w:val="0"/>
-          <w:sz w:val="16"/>
-          <w:szCs w:val="16"/>
-          <w:lang w:eastAsia="en-GB"/>
-          <w14:ligatures w14:val="none"/>
-        </w:rPr>
-        <w:t>=</w:t>
-      </w:r>
-      <w:r>
-        <w:rPr>
-          <w:rFonts w:ascii="Consolas" w:eastAsia="Times New Roman" w:hAnsi="Consolas" w:cs="Times New Roman"/>
-          <w:color w:val="BEA6A6"/>
-          <w:kern w:val="0"/>
-          <w:sz w:val="16"/>
-          <w:szCs w:val="16"/>
-          <w:lang w:eastAsia="en-GB"/>
-          <w14:ligatures w14:val="none"/>
-        </w:rPr>
-        <w:t xml:space="preserve"> </w:t>
-      </w:r>
-      <w:proofErr w:type="spellStart"/>
-      <w:proofErr w:type="gramStart"/>
+      <w:proofErr w:type="spellStart"/>
       <w:r>
         <w:rPr>
           <w:rFonts w:ascii="Consolas" w:eastAsia="Times New Roman" w:hAnsi="Consolas" w:cs="Times New Roman"/>
@@ -3623,7 +2999,6 @@
         <w:t>body</w:t>
       </w:r>
       <w:proofErr w:type="spellEnd"/>
-      <w:proofErr w:type="gramEnd"/>
       <w:r>
         <w:rPr>
           <w:rFonts w:ascii="Consolas" w:eastAsia="Times New Roman" w:hAnsi="Consolas" w:cs="Times New Roman"/>
@@ -3742,20 +3117,7 @@
           <w:lang w:eastAsia="en-GB"/>
           <w14:ligatures w14:val="none"/>
         </w:rPr>
-        <w:t xml:space="preserve"> </w:t>
-      </w:r>
-      <w:proofErr w:type="gramStart"/>
-      <w:r>
-        <w:rPr>
-          <w:rFonts w:ascii="Consolas" w:eastAsia="Times New Roman" w:hAnsi="Consolas" w:cs="Times New Roman"/>
-          <w:color w:val="BEA6A6"/>
-          <w:kern w:val="0"/>
-          <w:sz w:val="16"/>
-          <w:szCs w:val="16"/>
-          <w:lang w:eastAsia="en-GB"/>
-          <w14:ligatures w14:val="none"/>
-        </w:rPr>
-        <w:t>(</w:t>
+        <w:t xml:space="preserve"> (</w:t>
       </w:r>
       <w:r>
         <w:rPr>
@@ -3807,7 +3169,6 @@
         <w:t>isArray</w:t>
       </w:r>
       <w:proofErr w:type="spellEnd"/>
-      <w:proofErr w:type="gramEnd"/>
       <w:r>
         <w:rPr>
           <w:rFonts w:ascii="Consolas" w:eastAsia="Times New Roman" w:hAnsi="Consolas" w:cs="Times New Roman"/>
@@ -4020,7 +3381,6 @@
         <w:t xml:space="preserve"> </w:t>
       </w:r>
       <w:proofErr w:type="spellStart"/>
-      <w:proofErr w:type="gramStart"/>
       <w:r>
         <w:rPr>
           <w:rFonts w:ascii="Consolas" w:eastAsia="Times New Roman" w:hAnsi="Consolas" w:cs="Times New Roman"/>
@@ -4060,7 +3420,6 @@
         <w:t>status</w:t>
       </w:r>
       <w:proofErr w:type="spellEnd"/>
-      <w:proofErr w:type="gramEnd"/>
       <w:r>
         <w:rPr>
           <w:rFonts w:ascii="Consolas" w:eastAsia="Times New Roman" w:hAnsi="Consolas" w:cs="Times New Roman"/>
@@ -4085,7 +3444,6 @@
         </w:rPr>
         <w:t>400</w:t>
       </w:r>
-      <w:proofErr w:type="gramStart"/>
       <w:r>
         <w:rPr>
           <w:rFonts w:ascii="Consolas" w:eastAsia="Times New Roman" w:hAnsi="Consolas" w:cs="Times New Roman"/>
@@ -4136,7 +3494,6 @@
         </w:rPr>
         <w:t>error</w:t>
       </w:r>
-      <w:proofErr w:type="gramEnd"/>
       <w:r>
         <w:rPr>
           <w:rFonts w:ascii="Consolas" w:eastAsia="Times New Roman" w:hAnsi="Consolas" w:cs="Times New Roman"/>
@@ -4185,20 +3542,7 @@
           <w:lang w:eastAsia="en-GB"/>
           <w14:ligatures w14:val="none"/>
         </w:rPr>
-        <w:t xml:space="preserve"> must be a non-empty array</w:t>
-      </w:r>
-      <w:proofErr w:type="gramStart"/>
-      <w:r>
-        <w:rPr>
-          <w:rFonts w:ascii="Consolas" w:eastAsia="Times New Roman" w:hAnsi="Consolas" w:cs="Times New Roman"/>
-          <w:color w:val="98C379"/>
-          <w:kern w:val="0"/>
-          <w:sz w:val="16"/>
-          <w:szCs w:val="16"/>
-          <w:lang w:eastAsia="en-GB"/>
-          <w14:ligatures w14:val="none"/>
-        </w:rPr>
-        <w:t>'</w:t>
+        <w:t xml:space="preserve"> must be a non-empty array'</w:t>
       </w:r>
       <w:r>
         <w:rPr>
@@ -4212,7 +3556,6 @@
         </w:rPr>
         <w:t xml:space="preserve"> });</w:t>
       </w:r>
-      <w:proofErr w:type="gramEnd"/>
     </w:p>
     <w:p>
       <w:pPr>
@@ -4333,7 +3676,6 @@
         <w:t xml:space="preserve"> </w:t>
       </w:r>
       <w:proofErr w:type="spellStart"/>
-      <w:proofErr w:type="gramStart"/>
       <w:r>
         <w:rPr>
           <w:rFonts w:ascii="Consolas" w:eastAsia="Times New Roman" w:hAnsi="Consolas" w:cs="Times New Roman"/>
@@ -4369,9 +3711,44 @@
           <w:lang w:eastAsia="en-GB"/>
           <w14:ligatures w14:val="none"/>
         </w:rPr>
-        <w:t>!</w:t>
-      </w:r>
-      <w:proofErr w:type="gramEnd"/>
+        <w:t>!==</w:t>
+      </w:r>
+      <w:r>
+        <w:rPr>
+          <w:rFonts w:ascii="Consolas" w:eastAsia="Times New Roman" w:hAnsi="Consolas" w:cs="Times New Roman"/>
+          <w:color w:val="BEA6A6"/>
+          <w:kern w:val="0"/>
+          <w:sz w:val="16"/>
+          <w:szCs w:val="16"/>
+          <w:lang w:eastAsia="en-GB"/>
+          <w14:ligatures w14:val="none"/>
+        </w:rPr>
+        <w:t xml:space="preserve"> </w:t>
+      </w:r>
+      <w:r>
+        <w:rPr>
+          <w:rFonts w:ascii="Consolas" w:eastAsia="Times New Roman" w:hAnsi="Consolas" w:cs="Times New Roman"/>
+          <w:color w:val="98C379"/>
+          <w:kern w:val="0"/>
+          <w:sz w:val="16"/>
+          <w:szCs w:val="16"/>
+          <w:lang w:eastAsia="en-GB"/>
+          <w14:ligatures w14:val="none"/>
+        </w:rPr>
+        <w:t>'string'</w:t>
+      </w:r>
+      <w:r>
+        <w:rPr>
+          <w:rFonts w:ascii="Consolas" w:eastAsia="Times New Roman" w:hAnsi="Consolas" w:cs="Times New Roman"/>
+          <w:color w:val="BEA6A6"/>
+          <w:kern w:val="0"/>
+          <w:sz w:val="16"/>
+          <w:szCs w:val="16"/>
+          <w:lang w:eastAsia="en-GB"/>
+          <w14:ligatures w14:val="none"/>
+        </w:rPr>
+        <w:t xml:space="preserve"> </w:t>
+      </w:r>
       <w:r>
         <w:rPr>
           <w:rFonts w:ascii="Consolas" w:eastAsia="Times New Roman" w:hAnsi="Consolas" w:cs="Times New Roman"/>
@@ -4382,7 +3759,7 @@
           <w:lang w:eastAsia="en-GB"/>
           <w14:ligatures w14:val="none"/>
         </w:rPr>
-        <w:t>==</w:t>
+        <w:t>||</w:t>
       </w:r>
       <w:r>
         <w:rPr>
@@ -4396,18 +3773,20 @@
         </w:rPr>
         <w:t xml:space="preserve"> </w:t>
       </w:r>
-      <w:r>
-        <w:rPr>
-          <w:rFonts w:ascii="Consolas" w:eastAsia="Times New Roman" w:hAnsi="Consolas" w:cs="Times New Roman"/>
-          <w:color w:val="98C379"/>
-          <w:kern w:val="0"/>
-          <w:sz w:val="16"/>
-          <w:szCs w:val="16"/>
-          <w:lang w:eastAsia="en-GB"/>
-          <w14:ligatures w14:val="none"/>
-        </w:rPr>
-        <w:t>'string'</w:t>
-      </w:r>
+      <w:proofErr w:type="spellStart"/>
+      <w:r>
+        <w:rPr>
+          <w:rFonts w:ascii="Consolas" w:eastAsia="Times New Roman" w:hAnsi="Consolas" w:cs="Times New Roman"/>
+          <w:color w:val="C678DD"/>
+          <w:kern w:val="0"/>
+          <w:sz w:val="16"/>
+          <w:szCs w:val="16"/>
+          <w:lang w:eastAsia="en-GB"/>
+          <w14:ligatures w14:val="none"/>
+        </w:rPr>
+        <w:t>typeof</w:t>
+      </w:r>
+      <w:proofErr w:type="spellEnd"/>
       <w:r>
         <w:rPr>
           <w:rFonts w:ascii="Consolas" w:eastAsia="Times New Roman" w:hAnsi="Consolas" w:cs="Times New Roman"/>
@@ -4423,6 +3802,30 @@
       <w:r>
         <w:rPr>
           <w:rFonts w:ascii="Consolas" w:eastAsia="Times New Roman" w:hAnsi="Consolas" w:cs="Times New Roman"/>
+          <w:color w:val="E5C07B"/>
+          <w:kern w:val="0"/>
+          <w:sz w:val="16"/>
+          <w:szCs w:val="16"/>
+          <w:lang w:eastAsia="en-GB"/>
+          <w14:ligatures w14:val="none"/>
+        </w:rPr>
+        <w:t>budget</w:t>
+      </w:r>
+      <w:r>
+        <w:rPr>
+          <w:rFonts w:ascii="Consolas" w:eastAsia="Times New Roman" w:hAnsi="Consolas" w:cs="Times New Roman"/>
+          <w:color w:val="BEA6A6"/>
+          <w:kern w:val="0"/>
+          <w:sz w:val="16"/>
+          <w:szCs w:val="16"/>
+          <w:lang w:eastAsia="en-GB"/>
+          <w14:ligatures w14:val="none"/>
+        </w:rPr>
+        <w:t xml:space="preserve"> </w:t>
+      </w:r>
+      <w:r>
+        <w:rPr>
+          <w:rFonts w:ascii="Consolas" w:eastAsia="Times New Roman" w:hAnsi="Consolas" w:cs="Times New Roman"/>
           <w:color w:val="56B6C2"/>
           <w:kern w:val="0"/>
           <w:sz w:val="16"/>
@@ -4430,95 +3833,7 @@
           <w:lang w:eastAsia="en-GB"/>
           <w14:ligatures w14:val="none"/>
         </w:rPr>
-        <w:t>||</w:t>
-      </w:r>
-      <w:r>
-        <w:rPr>
-          <w:rFonts w:ascii="Consolas" w:eastAsia="Times New Roman" w:hAnsi="Consolas" w:cs="Times New Roman"/>
-          <w:color w:val="BEA6A6"/>
-          <w:kern w:val="0"/>
-          <w:sz w:val="16"/>
-          <w:szCs w:val="16"/>
-          <w:lang w:eastAsia="en-GB"/>
-          <w14:ligatures w14:val="none"/>
-        </w:rPr>
-        <w:t xml:space="preserve"> </w:t>
-      </w:r>
-      <w:proofErr w:type="spellStart"/>
-      <w:r>
-        <w:rPr>
-          <w:rFonts w:ascii="Consolas" w:eastAsia="Times New Roman" w:hAnsi="Consolas" w:cs="Times New Roman"/>
-          <w:color w:val="C678DD"/>
-          <w:kern w:val="0"/>
-          <w:sz w:val="16"/>
-          <w:szCs w:val="16"/>
-          <w:lang w:eastAsia="en-GB"/>
-          <w14:ligatures w14:val="none"/>
-        </w:rPr>
-        <w:t>typeof</w:t>
-      </w:r>
-      <w:proofErr w:type="spellEnd"/>
-      <w:r>
-        <w:rPr>
-          <w:rFonts w:ascii="Consolas" w:eastAsia="Times New Roman" w:hAnsi="Consolas" w:cs="Times New Roman"/>
-          <w:color w:val="BEA6A6"/>
-          <w:kern w:val="0"/>
-          <w:sz w:val="16"/>
-          <w:szCs w:val="16"/>
-          <w:lang w:eastAsia="en-GB"/>
-          <w14:ligatures w14:val="none"/>
-        </w:rPr>
-        <w:t xml:space="preserve"> </w:t>
-      </w:r>
-      <w:proofErr w:type="gramStart"/>
-      <w:r>
-        <w:rPr>
-          <w:rFonts w:ascii="Consolas" w:eastAsia="Times New Roman" w:hAnsi="Consolas" w:cs="Times New Roman"/>
-          <w:color w:val="E5C07B"/>
-          <w:kern w:val="0"/>
-          <w:sz w:val="16"/>
-          <w:szCs w:val="16"/>
-          <w:lang w:eastAsia="en-GB"/>
-          <w14:ligatures w14:val="none"/>
-        </w:rPr>
-        <w:t>budget</w:t>
-      </w:r>
-      <w:r>
-        <w:rPr>
-          <w:rFonts w:ascii="Consolas" w:eastAsia="Times New Roman" w:hAnsi="Consolas" w:cs="Times New Roman"/>
-          <w:color w:val="BEA6A6"/>
-          <w:kern w:val="0"/>
-          <w:sz w:val="16"/>
-          <w:szCs w:val="16"/>
-          <w:lang w:eastAsia="en-GB"/>
-          <w14:ligatures w14:val="none"/>
-        </w:rPr>
-        <w:t xml:space="preserve"> </w:t>
-      </w:r>
-      <w:r>
-        <w:rPr>
-          <w:rFonts w:ascii="Consolas" w:eastAsia="Times New Roman" w:hAnsi="Consolas" w:cs="Times New Roman"/>
-          <w:color w:val="56B6C2"/>
-          <w:kern w:val="0"/>
-          <w:sz w:val="16"/>
-          <w:szCs w:val="16"/>
-          <w:lang w:eastAsia="en-GB"/>
-          <w14:ligatures w14:val="none"/>
-        </w:rPr>
-        <w:t>!</w:t>
-      </w:r>
-      <w:proofErr w:type="gramEnd"/>
-      <w:r>
-        <w:rPr>
-          <w:rFonts w:ascii="Consolas" w:eastAsia="Times New Roman" w:hAnsi="Consolas" w:cs="Times New Roman"/>
-          <w:color w:val="56B6C2"/>
-          <w:kern w:val="0"/>
-          <w:sz w:val="16"/>
-          <w:szCs w:val="16"/>
-          <w:lang w:eastAsia="en-GB"/>
-          <w14:ligatures w14:val="none"/>
-        </w:rPr>
-        <w:t>==</w:t>
+        <w:t>!==</w:t>
       </w:r>
       <w:r>
         <w:rPr>
@@ -4608,7 +3923,6 @@
         <w:t xml:space="preserve"> </w:t>
       </w:r>
       <w:proofErr w:type="spellStart"/>
-      <w:proofErr w:type="gramStart"/>
       <w:r>
         <w:rPr>
           <w:rFonts w:ascii="Consolas" w:eastAsia="Times New Roman" w:hAnsi="Consolas" w:cs="Times New Roman"/>
@@ -4648,7 +3962,6 @@
         <w:t>status</w:t>
       </w:r>
       <w:proofErr w:type="spellEnd"/>
-      <w:proofErr w:type="gramEnd"/>
       <w:r>
         <w:rPr>
           <w:rFonts w:ascii="Consolas" w:eastAsia="Times New Roman" w:hAnsi="Consolas" w:cs="Times New Roman"/>
@@ -4673,7 +3986,6 @@
         </w:rPr>
         <w:t>400</w:t>
       </w:r>
-      <w:proofErr w:type="gramStart"/>
       <w:r>
         <w:rPr>
           <w:rFonts w:ascii="Consolas" w:eastAsia="Times New Roman" w:hAnsi="Consolas" w:cs="Times New Roman"/>
@@ -4724,7 +4036,6 @@
         </w:rPr>
         <w:t>error</w:t>
       </w:r>
-      <w:proofErr w:type="gramEnd"/>
       <w:r>
         <w:rPr>
           <w:rFonts w:ascii="Consolas" w:eastAsia="Times New Roman" w:hAnsi="Consolas" w:cs="Times New Roman"/>
@@ -4773,20 +4084,7 @@
           <w:lang w:eastAsia="en-GB"/>
           <w14:ligatures w14:val="none"/>
         </w:rPr>
-        <w:t xml:space="preserve"> and budget are required</w:t>
-      </w:r>
-      <w:proofErr w:type="gramStart"/>
-      <w:r>
-        <w:rPr>
-          <w:rFonts w:ascii="Consolas" w:eastAsia="Times New Roman" w:hAnsi="Consolas" w:cs="Times New Roman"/>
-          <w:color w:val="98C379"/>
-          <w:kern w:val="0"/>
-          <w:sz w:val="16"/>
-          <w:szCs w:val="16"/>
-          <w:lang w:eastAsia="en-GB"/>
-          <w14:ligatures w14:val="none"/>
-        </w:rPr>
-        <w:t>'</w:t>
+        <w:t xml:space="preserve"> and budget are required'</w:t>
       </w:r>
       <w:r>
         <w:rPr>
@@ -4800,7 +4098,6 @@
         </w:rPr>
         <w:t xml:space="preserve"> });</w:t>
       </w:r>
-      <w:proofErr w:type="gramEnd"/>
     </w:p>
     <w:p>
       <w:pPr>
@@ -5008,7 +4305,6 @@
         <w:t>matchIds</w:t>
       </w:r>
       <w:proofErr w:type="spellEnd"/>
-      <w:proofErr w:type="gramStart"/>
       <w:r>
         <w:rPr>
           <w:rFonts w:ascii="Consolas" w:eastAsia="Times New Roman" w:hAnsi="Consolas" w:cs="Times New Roman"/>
@@ -5021,7 +4317,6 @@
         </w:rPr>
         <w:t>);</w:t>
       </w:r>
-      <w:proofErr w:type="gramEnd"/>
     </w:p>
     <w:p>
       <w:pPr>
@@ -5189,7 +4484,6 @@
         <w:t>originCityId</w:t>
       </w:r>
       <w:proofErr w:type="spellEnd"/>
-      <w:proofErr w:type="gramStart"/>
       <w:r>
         <w:rPr>
           <w:rFonts w:ascii="Consolas" w:eastAsia="Times New Roman" w:hAnsi="Consolas" w:cs="Times New Roman"/>
@@ -5202,7 +4496,6 @@
         </w:rPr>
         <w:t>);</w:t>
       </w:r>
-      <w:proofErr w:type="gramEnd"/>
     </w:p>
     <w:p>
       <w:pPr>
@@ -5352,22 +4645,8 @@
           <w:lang w:eastAsia="en-GB"/>
           <w14:ligatures w14:val="none"/>
         </w:rPr>
-        <w:t>(</w:t>
-      </w:r>
-      <w:proofErr w:type="gramStart"/>
-      <w:r>
-        <w:rPr>
-          <w:rFonts w:ascii="Consolas" w:eastAsia="Times New Roman" w:hAnsi="Consolas" w:cs="Times New Roman"/>
-          <w:color w:val="BEA6A6"/>
-          <w:kern w:val="0"/>
-          <w:sz w:val="16"/>
-          <w:szCs w:val="16"/>
-          <w:lang w:eastAsia="en-GB"/>
-          <w14:ligatures w14:val="none"/>
-        </w:rPr>
-        <w:t>);</w:t>
-      </w:r>
-      <w:proofErr w:type="gramEnd"/>
+        <w:t>();</w:t>
+      </w:r>
     </w:p>
     <w:p>
       <w:pPr>
@@ -5432,20 +4711,7 @@
           <w:lang w:eastAsia="en-GB"/>
           <w14:ligatures w14:val="none"/>
         </w:rPr>
-        <w:t xml:space="preserve"> </w:t>
-      </w:r>
-      <w:proofErr w:type="gramStart"/>
-      <w:r>
-        <w:rPr>
-          <w:rFonts w:ascii="Consolas" w:eastAsia="Times New Roman" w:hAnsi="Consolas" w:cs="Times New Roman"/>
-          <w:color w:val="BEA6A6"/>
-          <w:kern w:val="0"/>
-          <w:sz w:val="16"/>
-          <w:szCs w:val="16"/>
-          <w:lang w:eastAsia="en-GB"/>
-          <w14:ligatures w14:val="none"/>
-        </w:rPr>
-        <w:t>(</w:t>
+        <w:t xml:space="preserve"> (</w:t>
       </w:r>
       <w:r>
         <w:rPr>
@@ -5473,7 +4739,6 @@
         <w:t>originCity</w:t>
       </w:r>
       <w:proofErr w:type="spellEnd"/>
-      <w:proofErr w:type="gramEnd"/>
       <w:r>
         <w:rPr>
           <w:rFonts w:ascii="Consolas" w:eastAsia="Times New Roman" w:hAnsi="Consolas" w:cs="Times New Roman"/>
@@ -5538,7 +4803,6 @@
         <w:t xml:space="preserve"> </w:t>
       </w:r>
       <w:proofErr w:type="spellStart"/>
-      <w:proofErr w:type="gramStart"/>
       <w:r>
         <w:rPr>
           <w:rFonts w:ascii="Consolas" w:eastAsia="Times New Roman" w:hAnsi="Consolas" w:cs="Times New Roman"/>
@@ -5578,7 +4842,6 @@
         <w:t>status</w:t>
       </w:r>
       <w:proofErr w:type="spellEnd"/>
-      <w:proofErr w:type="gramEnd"/>
       <w:r>
         <w:rPr>
           <w:rFonts w:ascii="Consolas" w:eastAsia="Times New Roman" w:hAnsi="Consolas" w:cs="Times New Roman"/>
@@ -5603,7 +4866,6 @@
         </w:rPr>
         <w:t>404</w:t>
       </w:r>
-      <w:proofErr w:type="gramStart"/>
       <w:r>
         <w:rPr>
           <w:rFonts w:ascii="Consolas" w:eastAsia="Times New Roman" w:hAnsi="Consolas" w:cs="Times New Roman"/>
@@ -5654,7 +4916,6 @@
         </w:rPr>
         <w:t>error</w:t>
       </w:r>
-      <w:proofErr w:type="gramEnd"/>
       <w:r>
         <w:rPr>
           <w:rFonts w:ascii="Consolas" w:eastAsia="Times New Roman" w:hAnsi="Consolas" w:cs="Times New Roman"/>
@@ -5677,20 +4938,7 @@
           <w:lang w:eastAsia="en-GB"/>
           <w14:ligatures w14:val="none"/>
         </w:rPr>
-        <w:t>'Origin city not found</w:t>
-      </w:r>
-      <w:proofErr w:type="gramStart"/>
-      <w:r>
-        <w:rPr>
-          <w:rFonts w:ascii="Consolas" w:eastAsia="Times New Roman" w:hAnsi="Consolas" w:cs="Times New Roman"/>
-          <w:color w:val="98C379"/>
-          <w:kern w:val="0"/>
-          <w:sz w:val="16"/>
-          <w:szCs w:val="16"/>
-          <w:lang w:eastAsia="en-GB"/>
-          <w14:ligatures w14:val="none"/>
-        </w:rPr>
-        <w:t>'</w:t>
+        <w:t>'Origin city not found'</w:t>
       </w:r>
       <w:r>
         <w:rPr>
@@ -5704,7 +4952,6 @@
         </w:rPr>
         <w:t xml:space="preserve"> });</w:t>
       </w:r>
-      <w:proofErr w:type="gramEnd"/>
     </w:p>
     <w:p>
       <w:pPr>
@@ -5799,7 +5046,6 @@
         <w:t xml:space="preserve"> (</w:t>
       </w:r>
       <w:proofErr w:type="spellStart"/>
-      <w:proofErr w:type="gramStart"/>
       <w:r>
         <w:rPr>
           <w:rFonts w:ascii="Consolas" w:eastAsia="Times New Roman" w:hAnsi="Consolas" w:cs="Times New Roman"/>
@@ -5837,7 +5083,6 @@
         <w:t>length</w:t>
       </w:r>
       <w:proofErr w:type="spellEnd"/>
-      <w:proofErr w:type="gramEnd"/>
       <w:r>
         <w:rPr>
           <w:rFonts w:ascii="Consolas" w:eastAsia="Times New Roman" w:hAnsi="Consolas" w:cs="Times New Roman"/>
@@ -5950,7 +5195,6 @@
         <w:t xml:space="preserve"> </w:t>
       </w:r>
       <w:proofErr w:type="spellStart"/>
-      <w:proofErr w:type="gramStart"/>
       <w:r>
         <w:rPr>
           <w:rFonts w:ascii="Consolas" w:eastAsia="Times New Roman" w:hAnsi="Consolas" w:cs="Times New Roman"/>
@@ -5990,7 +5234,6 @@
         <w:t>status</w:t>
       </w:r>
       <w:proofErr w:type="spellEnd"/>
-      <w:proofErr w:type="gramEnd"/>
       <w:r>
         <w:rPr>
           <w:rFonts w:ascii="Consolas" w:eastAsia="Times New Roman" w:hAnsi="Consolas" w:cs="Times New Roman"/>
@@ -6015,7 +5258,6 @@
         </w:rPr>
         <w:t>404</w:t>
       </w:r>
-      <w:proofErr w:type="gramStart"/>
       <w:r>
         <w:rPr>
           <w:rFonts w:ascii="Consolas" w:eastAsia="Times New Roman" w:hAnsi="Consolas" w:cs="Times New Roman"/>
@@ -6066,7 +5308,6 @@
         </w:rPr>
         <w:t>error</w:t>
       </w:r>
-      <w:proofErr w:type="gramEnd"/>
       <w:r>
         <w:rPr>
           <w:rFonts w:ascii="Consolas" w:eastAsia="Times New Roman" w:hAnsi="Consolas" w:cs="Times New Roman"/>
@@ -6089,20 +5330,7 @@
           <w:lang w:eastAsia="en-GB"/>
           <w14:ligatures w14:val="none"/>
         </w:rPr>
-        <w:t>'No matches found</w:t>
-      </w:r>
-      <w:proofErr w:type="gramStart"/>
-      <w:r>
-        <w:rPr>
-          <w:rFonts w:ascii="Consolas" w:eastAsia="Times New Roman" w:hAnsi="Consolas" w:cs="Times New Roman"/>
-          <w:color w:val="98C379"/>
-          <w:kern w:val="0"/>
-          <w:sz w:val="16"/>
-          <w:szCs w:val="16"/>
-          <w:lang w:eastAsia="en-GB"/>
-          <w14:ligatures w14:val="none"/>
-        </w:rPr>
-        <w:t>'</w:t>
+        <w:t>'No matches found'</w:t>
       </w:r>
       <w:r>
         <w:rPr>
@@ -6116,7 +5344,6 @@
         </w:rPr>
         <w:t xml:space="preserve"> });</w:t>
       </w:r>
-      <w:proofErr w:type="gramEnd"/>
     </w:p>
     <w:p>
       <w:pPr>
@@ -6387,7 +5614,6 @@
         </w:rPr>
         <w:t>number</w:t>
       </w:r>
-      <w:proofErr w:type="gramStart"/>
       <w:r>
         <w:rPr>
           <w:rFonts w:ascii="Consolas" w:eastAsia="Times New Roman" w:hAnsi="Consolas" w:cs="Times New Roman"/>
@@ -6400,7 +5626,6 @@
         </w:rPr>
         <w:t>&gt;(</w:t>
       </w:r>
-      <w:proofErr w:type="gramEnd"/>
     </w:p>
     <w:p>
       <w:pPr>
@@ -6429,7 +5654,6 @@
         <w:t xml:space="preserve">      </w:t>
       </w:r>
       <w:proofErr w:type="spellStart"/>
-      <w:proofErr w:type="gramStart"/>
       <w:r>
         <w:rPr>
           <w:rFonts w:ascii="Consolas" w:eastAsia="Times New Roman" w:hAnsi="Consolas" w:cs="Times New Roman"/>
@@ -6477,20 +5701,7 @@
           <w:lang w:eastAsia="en-GB"/>
           <w14:ligatures w14:val="none"/>
         </w:rPr>
-        <w:t>(</w:t>
-      </w:r>
-      <w:proofErr w:type="gramEnd"/>
-      <w:r>
-        <w:rPr>
-          <w:rFonts w:ascii="Consolas" w:eastAsia="Times New Roman" w:hAnsi="Consolas" w:cs="Times New Roman"/>
-          <w:color w:val="BEA6A6"/>
-          <w:kern w:val="0"/>
-          <w:sz w:val="16"/>
-          <w:szCs w:val="16"/>
-          <w:lang w:eastAsia="en-GB"/>
-          <w14:ligatures w14:val="none"/>
-        </w:rPr>
-        <w:t>(</w:t>
+        <w:t>((</w:t>
       </w:r>
       <w:r>
         <w:rPr>
@@ -6618,7 +5829,6 @@
         <w:t>${</w:t>
       </w:r>
       <w:proofErr w:type="spellStart"/>
-      <w:proofErr w:type="gramStart"/>
       <w:r>
         <w:rPr>
           <w:rFonts w:ascii="Consolas" w:eastAsia="Times New Roman" w:hAnsi="Consolas" w:cs="Times New Roman"/>
@@ -6655,20 +5865,7 @@
           <w:lang w:eastAsia="en-GB"/>
           <w14:ligatures w14:val="none"/>
         </w:rPr>
-        <w:t>origin</w:t>
-      </w:r>
-      <w:proofErr w:type="gramEnd"/>
-      <w:r>
-        <w:rPr>
-          <w:rFonts w:ascii="Consolas" w:eastAsia="Times New Roman" w:hAnsi="Consolas" w:cs="Times New Roman"/>
-          <w:color w:val="E06C75"/>
-          <w:kern w:val="0"/>
-          <w:sz w:val="16"/>
-          <w:szCs w:val="16"/>
-          <w:lang w:eastAsia="en-GB"/>
-          <w14:ligatures w14:val="none"/>
-        </w:rPr>
-        <w:t>_city_id</w:t>
+        <w:t>origin_city_id</w:t>
       </w:r>
       <w:proofErr w:type="spellEnd"/>
       <w:r>
@@ -6708,7 +5905,6 @@
         <w:t>${</w:t>
       </w:r>
       <w:proofErr w:type="spellStart"/>
-      <w:proofErr w:type="gramStart"/>
       <w:r>
         <w:rPr>
           <w:rFonts w:ascii="Consolas" w:eastAsia="Times New Roman" w:hAnsi="Consolas" w:cs="Times New Roman"/>
@@ -6745,33 +5941,7 @@
           <w:lang w:eastAsia="en-GB"/>
           <w14:ligatures w14:val="none"/>
         </w:rPr>
-        <w:t>destination</w:t>
-      </w:r>
-      <w:proofErr w:type="gramEnd"/>
-      <w:r>
-        <w:rPr>
-          <w:rFonts w:ascii="Consolas" w:eastAsia="Times New Roman" w:hAnsi="Consolas" w:cs="Times New Roman"/>
-          <w:color w:val="E06C75"/>
-          <w:kern w:val="0"/>
-          <w:sz w:val="16"/>
-          <w:szCs w:val="16"/>
-          <w:lang w:eastAsia="en-GB"/>
-          <w14:ligatures w14:val="none"/>
-        </w:rPr>
-        <w:t>_city_</w:t>
-      </w:r>
-      <w:proofErr w:type="gramStart"/>
-      <w:r>
-        <w:rPr>
-          <w:rFonts w:ascii="Consolas" w:eastAsia="Times New Roman" w:hAnsi="Consolas" w:cs="Times New Roman"/>
-          <w:color w:val="E06C75"/>
-          <w:kern w:val="0"/>
-          <w:sz w:val="16"/>
-          <w:szCs w:val="16"/>
-          <w:lang w:eastAsia="en-GB"/>
-          <w14:ligatures w14:val="none"/>
-        </w:rPr>
-        <w:t>id</w:t>
+        <w:t>destination_city_id</w:t>
       </w:r>
       <w:proofErr w:type="spellEnd"/>
       <w:r>
@@ -6798,7 +5968,6 @@
         </w:rPr>
         <w:t>`</w:t>
       </w:r>
-      <w:proofErr w:type="gramEnd"/>
       <w:r>
         <w:rPr>
           <w:rFonts w:ascii="Consolas" w:eastAsia="Times New Roman" w:hAnsi="Consolas" w:cs="Times New Roman"/>
@@ -6839,7 +6008,6 @@
         <w:t xml:space="preserve">        </w:t>
       </w:r>
       <w:proofErr w:type="spellStart"/>
-      <w:proofErr w:type="gramStart"/>
       <w:r>
         <w:rPr>
           <w:rFonts w:ascii="Consolas" w:eastAsia="Times New Roman" w:hAnsi="Consolas" w:cs="Times New Roman"/>
@@ -6876,20 +6044,7 @@
           <w:lang w:eastAsia="en-GB"/>
           <w14:ligatures w14:val="none"/>
         </w:rPr>
-        <w:t>price</w:t>
-      </w:r>
-      <w:proofErr w:type="gramEnd"/>
-      <w:r>
-        <w:rPr>
-          <w:rFonts w:ascii="Consolas" w:eastAsia="Times New Roman" w:hAnsi="Consolas" w:cs="Times New Roman"/>
-          <w:color w:val="E06C75"/>
-          <w:kern w:val="0"/>
-          <w:sz w:val="16"/>
-          <w:szCs w:val="16"/>
-          <w:lang w:eastAsia="en-GB"/>
-          <w14:ligatures w14:val="none"/>
-        </w:rPr>
-        <w:t>_usd</w:t>
+        <w:t>price_usd</w:t>
       </w:r>
       <w:proofErr w:type="spellEnd"/>
       <w:r>
@@ -6956,22 +6111,8 @@
           <w:lang w:eastAsia="en-GB"/>
           <w14:ligatures w14:val="none"/>
         </w:rPr>
-        <w:t xml:space="preserve">    </w:t>
-      </w:r>
-      <w:proofErr w:type="gramStart"/>
-      <w:r>
-        <w:rPr>
-          <w:rFonts w:ascii="Consolas" w:eastAsia="Times New Roman" w:hAnsi="Consolas" w:cs="Times New Roman"/>
-          <w:color w:val="BEA6A6"/>
-          <w:kern w:val="0"/>
-          <w:sz w:val="16"/>
-          <w:szCs w:val="16"/>
-          <w:lang w:eastAsia="en-GB"/>
-          <w14:ligatures w14:val="none"/>
-        </w:rPr>
-        <w:t>);</w:t>
-      </w:r>
-      <w:proofErr w:type="gramEnd"/>
+        <w:t>    );</w:t>
+      </w:r>
     </w:p>
     <w:p>
       <w:pPr>
@@ -7132,7 +6273,6 @@
         <w:t xml:space="preserve"> </w:t>
       </w:r>
       <w:proofErr w:type="spellStart"/>
-      <w:proofErr w:type="gramStart"/>
       <w:r>
         <w:rPr>
           <w:rFonts w:ascii="Consolas" w:eastAsia="Times New Roman" w:hAnsi="Consolas" w:cs="Times New Roman"/>
@@ -7170,7 +6310,6 @@
         <w:t>reduce</w:t>
       </w:r>
       <w:proofErr w:type="spellEnd"/>
-      <w:proofErr w:type="gramEnd"/>
       <w:r>
         <w:rPr>
           <w:rFonts w:ascii="Consolas" w:eastAsia="Times New Roman" w:hAnsi="Consolas" w:cs="Times New Roman"/>
@@ -7310,7 +6449,6 @@
         <w:t xml:space="preserve"> </w:t>
       </w:r>
       <w:proofErr w:type="spellStart"/>
-      <w:proofErr w:type="gramStart"/>
       <w:r>
         <w:rPr>
           <w:rFonts w:ascii="Consolas" w:eastAsia="Times New Roman" w:hAnsi="Consolas" w:cs="Times New Roman"/>
@@ -7350,7 +6488,6 @@
         <w:t>ticketPrice</w:t>
       </w:r>
       <w:proofErr w:type="spellEnd"/>
-      <w:proofErr w:type="gramEnd"/>
       <w:r>
         <w:rPr>
           <w:rFonts w:ascii="Consolas" w:eastAsia="Times New Roman" w:hAnsi="Consolas" w:cs="Times New Roman"/>
@@ -7375,7 +6512,6 @@
         </w:rPr>
         <w:t>0</w:t>
       </w:r>
-      <w:proofErr w:type="gramStart"/>
       <w:r>
         <w:rPr>
           <w:rFonts w:ascii="Consolas" w:eastAsia="Times New Roman" w:hAnsi="Consolas" w:cs="Times New Roman"/>
@@ -7388,7 +6524,6 @@
         </w:rPr>
         <w:t>);</w:t>
       </w:r>
-      <w:proofErr w:type="gramEnd"/>
     </w:p>
     <w:p>
       <w:pPr>
@@ -7573,7 +6708,6 @@
         </w:rPr>
         <w:t xml:space="preserve"> </w:t>
       </w:r>
-      <w:proofErr w:type="gramStart"/>
       <w:r>
         <w:rPr>
           <w:rFonts w:ascii="Consolas" w:eastAsia="Times New Roman" w:hAnsi="Consolas" w:cs="Times New Roman"/>
@@ -7598,7 +6732,6 @@
         </w:rPr>
         <w:t>;</w:t>
       </w:r>
-      <w:proofErr w:type="gramEnd"/>
     </w:p>
     <w:p>
       <w:pPr>
@@ -7700,7 +6833,6 @@
         </w:rPr>
         <w:t xml:space="preserve"> </w:t>
       </w:r>
-      <w:proofErr w:type="gramStart"/>
       <w:r>
         <w:rPr>
           <w:rFonts w:ascii="Consolas" w:eastAsia="Times New Roman" w:hAnsi="Consolas" w:cs="Times New Roman"/>
@@ -7749,7 +6881,6 @@
         </w:rPr>
         <w:t>;</w:t>
       </w:r>
-      <w:proofErr w:type="gramEnd"/>
     </w:p>
     <w:p>
       <w:pPr>
@@ -8089,7 +7220,6 @@
         </w:rPr>
         <w:t>${</w:t>
       </w:r>
-      <w:proofErr w:type="gramStart"/>
       <w:r>
         <w:rPr>
           <w:rFonts w:ascii="Consolas" w:eastAsia="Times New Roman" w:hAnsi="Consolas" w:cs="Times New Roman"/>
@@ -8174,7 +7304,6 @@
         </w:rPr>
         <w:t>`</w:t>
       </w:r>
-      <w:proofErr w:type="gramEnd"/>
       <w:r>
         <w:rPr>
           <w:rFonts w:ascii="Consolas" w:eastAsia="Times New Roman" w:hAnsi="Consolas" w:cs="Times New Roman"/>
@@ -8374,7 +7503,6 @@
         </w:rPr>
         <w:t>key</w:t>
       </w:r>
-      <w:proofErr w:type="gramStart"/>
       <w:r>
         <w:rPr>
           <w:rFonts w:ascii="Consolas" w:eastAsia="Times New Roman" w:hAnsi="Consolas" w:cs="Times New Roman"/>
@@ -8399,7 +7527,6 @@
         </w:rPr>
         <w:t>??</w:t>
       </w:r>
-      <w:proofErr w:type="gramEnd"/>
       <w:r>
         <w:rPr>
           <w:rFonts w:ascii="Consolas" w:eastAsia="Times New Roman" w:hAnsi="Consolas" w:cs="Times New Roman"/>
@@ -8424,7 +7551,6 @@
         </w:rPr>
         <w:t>0</w:t>
       </w:r>
-      <w:proofErr w:type="gramStart"/>
       <w:r>
         <w:rPr>
           <w:rFonts w:ascii="Consolas" w:eastAsia="Times New Roman" w:hAnsi="Consolas" w:cs="Times New Roman"/>
@@ -8437,7 +7563,6 @@
         </w:rPr>
         <w:t>);</w:t>
       </w:r>
-      <w:proofErr w:type="gramEnd"/>
     </w:p>
     <w:p>
       <w:pPr>
@@ -8530,7 +7655,6 @@
         </w:rPr>
         <w:t xml:space="preserve"> </w:t>
       </w:r>
-      <w:proofErr w:type="gramStart"/>
       <w:r>
         <w:rPr>
           <w:rFonts w:ascii="Consolas" w:eastAsia="Times New Roman" w:hAnsi="Consolas" w:cs="Times New Roman"/>
@@ -8555,7 +7679,6 @@
         </w:rPr>
         <w:t>;</w:t>
       </w:r>
-      <w:proofErr w:type="gramEnd"/>
     </w:p>
     <w:p>
       <w:pPr>
@@ -8633,7 +7756,6 @@
         </w:rPr>
         <w:t xml:space="preserve"> </w:t>
       </w:r>
-      <w:proofErr w:type="gramStart"/>
       <w:r>
         <w:rPr>
           <w:rFonts w:ascii="Consolas" w:eastAsia="Times New Roman" w:hAnsi="Consolas" w:cs="Times New Roman"/>
@@ -8706,7 +7828,6 @@
         </w:rPr>
         <w:t>;</w:t>
       </w:r>
-      <w:proofErr w:type="gramEnd"/>
     </w:p>
     <w:p>
       <w:pPr>
@@ -8894,7 +8015,6 @@
         <w:t xml:space="preserve"> </w:t>
       </w:r>
       <w:proofErr w:type="spellStart"/>
-      <w:proofErr w:type="gramStart"/>
       <w:r>
         <w:rPr>
           <w:rFonts w:ascii="Consolas" w:eastAsia="Times New Roman" w:hAnsi="Consolas" w:cs="Times New Roman"/>
@@ -8932,7 +8052,6 @@
         <w:t>reduce</w:t>
       </w:r>
       <w:proofErr w:type="spellEnd"/>
-      <w:proofErr w:type="gramEnd"/>
       <w:r>
         <w:rPr>
           <w:rFonts w:ascii="Consolas" w:eastAsia="Times New Roman" w:hAnsi="Consolas" w:cs="Times New Roman"/>
@@ -9100,7 +8219,6 @@
         <w:t xml:space="preserve"> </w:t>
       </w:r>
       <w:proofErr w:type="spellStart"/>
-      <w:proofErr w:type="gramStart"/>
       <w:r>
         <w:rPr>
           <w:rFonts w:ascii="Consolas" w:eastAsia="Times New Roman" w:hAnsi="Consolas" w:cs="Times New Roman"/>
@@ -9139,7 +8257,6 @@
         </w:rPr>
         <w:t>city</w:t>
       </w:r>
-      <w:proofErr w:type="gramEnd"/>
       <w:r>
         <w:rPr>
           <w:rFonts w:ascii="Consolas" w:eastAsia="Times New Roman" w:hAnsi="Consolas" w:cs="Times New Roman"/>
@@ -9241,22 +8358,8 @@
           <w:lang w:eastAsia="en-GB"/>
           <w14:ligatures w14:val="none"/>
         </w:rPr>
-        <w:t xml:space="preserve">    </w:t>
-      </w:r>
-      <w:proofErr w:type="gramStart"/>
-      <w:r>
-        <w:rPr>
-          <w:rFonts w:ascii="Consolas" w:eastAsia="Times New Roman" w:hAnsi="Consolas" w:cs="Times New Roman"/>
-          <w:color w:val="BEA6A6"/>
-          <w:kern w:val="0"/>
-          <w:sz w:val="16"/>
-          <w:szCs w:val="16"/>
-          <w:lang w:eastAsia="en-GB"/>
-          <w14:ligatures w14:val="none"/>
-        </w:rPr>
-        <w:t>);</w:t>
-      </w:r>
-      <w:proofErr w:type="gramEnd"/>
+        <w:t>    );</w:t>
+      </w:r>
     </w:p>
     <w:p>
       <w:pPr>
@@ -9517,7 +8620,6 @@
         <w:t xml:space="preserve"> </w:t>
       </w:r>
       <w:proofErr w:type="spellStart"/>
-      <w:proofErr w:type="gramStart"/>
       <w:r>
         <w:rPr>
           <w:rFonts w:ascii="Consolas" w:eastAsia="Times New Roman" w:hAnsi="Consolas" w:cs="Times New Roman"/>
@@ -9543,7 +8645,6 @@
         </w:rPr>
         <w:t>;</w:t>
       </w:r>
-      <w:proofErr w:type="gramEnd"/>
     </w:p>
     <w:p>
       <w:pPr>
@@ -9804,7 +8905,6 @@
         </w:rPr>
         <w:t xml:space="preserve"> </w:t>
       </w:r>
-      <w:proofErr w:type="gramStart"/>
       <w:r>
         <w:rPr>
           <w:rFonts w:ascii="Consolas" w:eastAsia="Times New Roman" w:hAnsi="Consolas" w:cs="Times New Roman"/>
@@ -9879,7 +8979,6 @@
         </w:rPr>
         <w:t>(</w:t>
       </w:r>
-      <w:proofErr w:type="gramEnd"/>
       <w:r>
         <w:rPr>
           <w:rFonts w:ascii="Consolas" w:eastAsia="Times New Roman" w:hAnsi="Consolas" w:cs="Times New Roman"/>
@@ -9931,7 +9030,6 @@
         <w:t xml:space="preserve"> </w:t>
       </w:r>
       <w:proofErr w:type="spellStart"/>
-      <w:proofErr w:type="gramStart"/>
       <w:r>
         <w:rPr>
           <w:rFonts w:ascii="Consolas" w:eastAsia="Times New Roman" w:hAnsi="Consolas" w:cs="Times New Roman"/>
@@ -9970,7 +9068,6 @@
         </w:rPr>
         <w:t>city</w:t>
       </w:r>
-      <w:proofErr w:type="gramEnd"/>
       <w:r>
         <w:rPr>
           <w:rFonts w:ascii="Consolas" w:eastAsia="Times New Roman" w:hAnsi="Consolas" w:cs="Times New Roman"/>
@@ -10033,22 +9130,8 @@
           <w:lang w:eastAsia="en-GB"/>
           <w14:ligatures w14:val="none"/>
         </w:rPr>
-        <w:t xml:space="preserve">    </w:t>
-      </w:r>
-      <w:proofErr w:type="gramStart"/>
-      <w:r>
-        <w:rPr>
-          <w:rFonts w:ascii="Consolas" w:eastAsia="Times New Roman" w:hAnsi="Consolas" w:cs="Times New Roman"/>
-          <w:color w:val="BEA6A6"/>
-          <w:kern w:val="0"/>
-          <w:sz w:val="16"/>
-          <w:szCs w:val="16"/>
-          <w:lang w:eastAsia="en-GB"/>
-          <w14:ligatures w14:val="none"/>
-        </w:rPr>
-        <w:t>);</w:t>
-      </w:r>
-      <w:proofErr w:type="gramEnd"/>
+        <w:t>    );</w:t>
+      </w:r>
     </w:p>
     <w:p>
       <w:pPr>
@@ -10225,7 +9308,6 @@
         </w:rPr>
         <w:t>'Canada'</w:t>
       </w:r>
-      <w:proofErr w:type="gramStart"/>
       <w:r>
         <w:rPr>
           <w:rFonts w:ascii="Consolas" w:eastAsia="Times New Roman" w:hAnsi="Consolas" w:cs="Times New Roman"/>
@@ -10238,7 +9320,6 @@
         </w:rPr>
         <w:t>];</w:t>
       </w:r>
-      <w:proofErr w:type="gramEnd"/>
     </w:p>
     <w:p>
       <w:pPr>
@@ -10470,20 +9551,7 @@
           <w:lang w:eastAsia="en-GB"/>
           <w14:ligatures w14:val="none"/>
         </w:rPr>
-        <w:t>=</w:t>
-      </w:r>
-      <w:proofErr w:type="gramStart"/>
-      <w:r>
-        <w:rPr>
-          <w:rFonts w:ascii="Consolas" w:eastAsia="Times New Roman" w:hAnsi="Consolas" w:cs="Times New Roman"/>
-          <w:color w:val="C678DD"/>
-          <w:kern w:val="0"/>
-          <w:sz w:val="16"/>
-          <w:szCs w:val="16"/>
-          <w:lang w:eastAsia="en-GB"/>
-          <w14:ligatures w14:val="none"/>
-        </w:rPr>
-        <w:t>&gt;</w:t>
+        <w:t>=&gt;</w:t>
       </w:r>
       <w:r>
         <w:rPr>
@@ -10510,7 +9578,6 @@
         <w:t>!</w:t>
       </w:r>
       <w:proofErr w:type="spellStart"/>
-      <w:proofErr w:type="gramEnd"/>
       <w:r>
         <w:rPr>
           <w:rFonts w:ascii="Consolas" w:eastAsia="Times New Roman" w:hAnsi="Consolas" w:cs="Times New Roman"/>
@@ -10611,22 +9678,8 @@
           <w:lang w:eastAsia="en-GB"/>
           <w14:ligatures w14:val="none"/>
         </w:rPr>
-        <w:t xml:space="preserve">    </w:t>
-      </w:r>
-      <w:proofErr w:type="gramStart"/>
-      <w:r>
-        <w:rPr>
-          <w:rFonts w:ascii="Consolas" w:eastAsia="Times New Roman" w:hAnsi="Consolas" w:cs="Times New Roman"/>
-          <w:color w:val="BEA6A6"/>
-          <w:kern w:val="0"/>
-          <w:sz w:val="16"/>
-          <w:szCs w:val="16"/>
-          <w:lang w:eastAsia="en-GB"/>
-          <w14:ligatures w14:val="none"/>
-        </w:rPr>
-        <w:t>);</w:t>
-      </w:r>
-      <w:proofErr w:type="gramEnd"/>
+        <w:t>    );</w:t>
+      </w:r>
     </w:p>
     <w:p>
       <w:pPr>
@@ -10836,7 +9889,6 @@
         </w:rPr>
         <w:t xml:space="preserve"> </w:t>
       </w:r>
-      <w:proofErr w:type="gramStart"/>
       <w:r>
         <w:rPr>
           <w:rFonts w:ascii="Consolas" w:eastAsia="Times New Roman" w:hAnsi="Consolas" w:cs="Times New Roman"/>
@@ -10861,7 +9913,6 @@
         </w:rPr>
         <w:t>;</w:t>
       </w:r>
-      <w:proofErr w:type="gramEnd"/>
     </w:p>
     <w:p>
       <w:pPr>
@@ -11039,7 +10090,6 @@
         </w:rPr>
         <w:t xml:space="preserve"> </w:t>
       </w:r>
-      <w:proofErr w:type="gramStart"/>
       <w:r>
         <w:rPr>
           <w:rFonts w:ascii="Consolas" w:eastAsia="Times New Roman" w:hAnsi="Consolas" w:cs="Times New Roman"/>
@@ -11064,7 +10114,6 @@
         </w:rPr>
         <w:t>;</w:t>
       </w:r>
-      <w:proofErr w:type="gramEnd"/>
     </w:p>
     <w:p>
       <w:pPr>
@@ -11217,7 +10266,6 @@
         <w:t xml:space="preserve"> </w:t>
       </w:r>
       <w:proofErr w:type="spellStart"/>
-      <w:proofErr w:type="gramStart"/>
       <w:r>
         <w:rPr>
           <w:rFonts w:ascii="Consolas" w:eastAsia="Times New Roman" w:hAnsi="Consolas" w:cs="Times New Roman"/>
@@ -11243,7 +10291,6 @@
         </w:rPr>
         <w:t>;</w:t>
       </w:r>
-      <w:proofErr w:type="gramEnd"/>
     </w:p>
     <w:p>
       <w:pPr>
@@ -11377,7 +10424,6 @@
         </w:rPr>
         <w:t xml:space="preserve">: </w:t>
       </w:r>
-      <w:proofErr w:type="gramStart"/>
       <w:r>
         <w:rPr>
           <w:rFonts w:ascii="Consolas" w:eastAsia="Times New Roman" w:hAnsi="Consolas" w:cs="Times New Roman"/>
@@ -11400,20 +10446,7 @@
           <w:lang w:eastAsia="en-GB"/>
           <w14:ligatures w14:val="none"/>
         </w:rPr>
-        <w:t>[</w:t>
-      </w:r>
-      <w:proofErr w:type="gramEnd"/>
-      <w:r>
-        <w:rPr>
-          <w:rFonts w:ascii="Consolas" w:eastAsia="Times New Roman" w:hAnsi="Consolas" w:cs="Times New Roman"/>
-          <w:color w:val="BEA6A6"/>
-          <w:kern w:val="0"/>
-          <w:sz w:val="16"/>
-          <w:szCs w:val="16"/>
-          <w:lang w:eastAsia="en-GB"/>
-          <w14:ligatures w14:val="none"/>
-        </w:rPr>
-        <w:t xml:space="preserve">] </w:t>
+        <w:t xml:space="preserve">[] </w:t>
       </w:r>
       <w:r>
         <w:rPr>
@@ -11437,22 +10470,8 @@
           <w:lang w:eastAsia="en-GB"/>
           <w14:ligatures w14:val="none"/>
         </w:rPr>
-        <w:t xml:space="preserve"> [</w:t>
-      </w:r>
-      <w:proofErr w:type="gramStart"/>
-      <w:r>
-        <w:rPr>
-          <w:rFonts w:ascii="Consolas" w:eastAsia="Times New Roman" w:hAnsi="Consolas" w:cs="Times New Roman"/>
-          <w:color w:val="BEA6A6"/>
-          <w:kern w:val="0"/>
-          <w:sz w:val="16"/>
-          <w:szCs w:val="16"/>
-          <w:lang w:eastAsia="en-GB"/>
-          <w14:ligatures w14:val="none"/>
-        </w:rPr>
-        <w:t>];</w:t>
-      </w:r>
-      <w:proofErr w:type="gramEnd"/>
+        <w:t xml:space="preserve"> [];</w:t>
+      </w:r>
     </w:p>
     <w:p>
       <w:pPr>
@@ -11517,20 +10536,7 @@
           <w:lang w:eastAsia="en-GB"/>
           <w14:ligatures w14:val="none"/>
         </w:rPr>
-        <w:t xml:space="preserve"> </w:t>
-      </w:r>
-      <w:proofErr w:type="gramStart"/>
-      <w:r>
-        <w:rPr>
-          <w:rFonts w:ascii="Consolas" w:eastAsia="Times New Roman" w:hAnsi="Consolas" w:cs="Times New Roman"/>
-          <w:color w:val="BEA6A6"/>
-          <w:kern w:val="0"/>
-          <w:sz w:val="16"/>
-          <w:szCs w:val="16"/>
-          <w:lang w:eastAsia="en-GB"/>
-          <w14:ligatures w14:val="none"/>
-        </w:rPr>
-        <w:t>(</w:t>
+        <w:t xml:space="preserve"> (</w:t>
       </w:r>
       <w:r>
         <w:rPr>
@@ -11558,7 +10564,6 @@
         <w:t>withinBudget</w:t>
       </w:r>
       <w:proofErr w:type="spellEnd"/>
-      <w:proofErr w:type="gramEnd"/>
       <w:r>
         <w:rPr>
           <w:rFonts w:ascii="Consolas" w:eastAsia="Times New Roman" w:hAnsi="Consolas" w:cs="Times New Roman"/>
@@ -11599,7 +10604,6 @@
         <w:t xml:space="preserve">      </w:t>
       </w:r>
       <w:proofErr w:type="spellStart"/>
-      <w:proofErr w:type="gramStart"/>
       <w:r>
         <w:rPr>
           <w:rFonts w:ascii="Consolas" w:eastAsia="Times New Roman" w:hAnsi="Consolas" w:cs="Times New Roman"/>
@@ -11637,7 +10641,6 @@
         <w:t>push</w:t>
       </w:r>
       <w:proofErr w:type="spellEnd"/>
-      <w:proofErr w:type="gramEnd"/>
       <w:r>
         <w:rPr>
           <w:rFonts w:ascii="Consolas" w:eastAsia="Times New Roman" w:hAnsi="Consolas" w:cs="Times New Roman"/>
@@ -11662,7 +10665,6 @@
         </w:rPr>
         <w:t>'Reduce number of matches or choose cheaper cities'</w:t>
       </w:r>
-      <w:proofErr w:type="gramStart"/>
       <w:r>
         <w:rPr>
           <w:rFonts w:ascii="Consolas" w:eastAsia="Times New Roman" w:hAnsi="Consolas" w:cs="Times New Roman"/>
@@ -11675,7 +10677,6 @@
         </w:rPr>
         <w:t>);</w:t>
       </w:r>
-      <w:proofErr w:type="gramEnd"/>
     </w:p>
     <w:p>
       <w:pPr>
@@ -11767,20 +10768,7 @@
           <w:lang w:eastAsia="en-GB"/>
           <w14:ligatures w14:val="none"/>
         </w:rPr>
-        <w:t xml:space="preserve"> </w:t>
-      </w:r>
-      <w:proofErr w:type="gramStart"/>
-      <w:r>
-        <w:rPr>
-          <w:rFonts w:ascii="Consolas" w:eastAsia="Times New Roman" w:hAnsi="Consolas" w:cs="Times New Roman"/>
-          <w:color w:val="BEA6A6"/>
-          <w:kern w:val="0"/>
-          <w:sz w:val="16"/>
-          <w:szCs w:val="16"/>
-          <w:lang w:eastAsia="en-GB"/>
-          <w14:ligatures w14:val="none"/>
-        </w:rPr>
-        <w:t>(</w:t>
+        <w:t xml:space="preserve"> (</w:t>
       </w:r>
       <w:r>
         <w:rPr>
@@ -11808,7 +10796,6 @@
         <w:t>hasAllCountries</w:t>
       </w:r>
       <w:proofErr w:type="spellEnd"/>
-      <w:proofErr w:type="gramEnd"/>
       <w:r>
         <w:rPr>
           <w:rFonts w:ascii="Consolas" w:eastAsia="Times New Roman" w:hAnsi="Consolas" w:cs="Times New Roman"/>
@@ -11849,7 +10836,6 @@
         <w:t xml:space="preserve">      </w:t>
       </w:r>
       <w:proofErr w:type="spellStart"/>
-      <w:proofErr w:type="gramStart"/>
       <w:r>
         <w:rPr>
           <w:rFonts w:ascii="Consolas" w:eastAsia="Times New Roman" w:hAnsi="Consolas" w:cs="Times New Roman"/>
@@ -11887,7 +10873,6 @@
         <w:t>push</w:t>
       </w:r>
       <w:proofErr w:type="spellEnd"/>
-      <w:proofErr w:type="gramEnd"/>
       <w:r>
         <w:rPr>
           <w:rFonts w:ascii="Consolas" w:eastAsia="Times New Roman" w:hAnsi="Consolas" w:cs="Times New Roman"/>
@@ -11986,7 +10971,6 @@
         </w:rPr>
         <w:t>', '</w:t>
       </w:r>
-      <w:proofErr w:type="gramStart"/>
       <w:r>
         <w:rPr>
           <w:rFonts w:ascii="Consolas" w:eastAsia="Times New Roman" w:hAnsi="Consolas" w:cs="Times New Roman"/>
@@ -12035,7 +11019,6 @@
         </w:rPr>
         <w:t>);</w:t>
       </w:r>
-      <w:proofErr w:type="gramEnd"/>
     </w:p>
     <w:p>
       <w:pPr>
@@ -12171,7 +11154,6 @@
         <w:t xml:space="preserve"> </w:t>
       </w:r>
       <w:proofErr w:type="spellStart"/>
-      <w:proofErr w:type="gramStart"/>
       <w:r>
         <w:rPr>
           <w:rFonts w:ascii="Consolas" w:eastAsia="Times New Roman" w:hAnsi="Consolas" w:cs="Times New Roman"/>
@@ -12211,7 +11193,6 @@
         <w:t>status</w:t>
       </w:r>
       <w:proofErr w:type="spellEnd"/>
-      <w:proofErr w:type="gramEnd"/>
       <w:r>
         <w:rPr>
           <w:rFonts w:ascii="Consolas" w:eastAsia="Times New Roman" w:hAnsi="Consolas" w:cs="Times New Roman"/>
@@ -12236,7 +11217,6 @@
         </w:rPr>
         <w:t>200</w:t>
       </w:r>
-      <w:proofErr w:type="gramStart"/>
       <w:r>
         <w:rPr>
           <w:rFonts w:ascii="Consolas" w:eastAsia="Times New Roman" w:hAnsi="Consolas" w:cs="Times New Roman"/>
@@ -12263,7 +11243,6 @@
         <w:t>json</w:t>
       </w:r>
       <w:proofErr w:type="spellEnd"/>
-      <w:proofErr w:type="gramEnd"/>
       <w:r>
         <w:rPr>
           <w:rFonts w:ascii="Consolas" w:eastAsia="Times New Roman" w:hAnsi="Consolas" w:cs="Times New Roman"/>
@@ -13007,22 +11986,8 @@
           <w:lang w:eastAsia="en-GB"/>
           <w14:ligatures w14:val="none"/>
         </w:rPr>
-        <w:t>    }</w:t>
-      </w:r>
-      <w:proofErr w:type="gramStart"/>
-      <w:r>
-        <w:rPr>
-          <w:rFonts w:ascii="Consolas" w:eastAsia="Times New Roman" w:hAnsi="Consolas" w:cs="Times New Roman"/>
-          <w:color w:val="BEA6A6"/>
-          <w:kern w:val="0"/>
-          <w:sz w:val="16"/>
-          <w:szCs w:val="16"/>
-          <w:lang w:eastAsia="en-GB"/>
-          <w14:ligatures w14:val="none"/>
-        </w:rPr>
-        <w:t>);</w:t>
-      </w:r>
-      <w:proofErr w:type="gramEnd"/>
+        <w:t>    });</w:t>
+      </w:r>
     </w:p>
     <w:p>
       <w:pPr>
@@ -13141,7 +12106,6 @@
         <w:t xml:space="preserve">    </w:t>
       </w:r>
       <w:proofErr w:type="spellStart"/>
-      <w:proofErr w:type="gramStart"/>
       <w:r>
         <w:rPr>
           <w:rFonts w:ascii="Consolas" w:eastAsia="Times New Roman" w:hAnsi="Consolas" w:cs="Times New Roman"/>
@@ -13179,7 +12143,6 @@
         <w:t>error</w:t>
       </w:r>
       <w:proofErr w:type="spellEnd"/>
-      <w:proofErr w:type="gramEnd"/>
       <w:r>
         <w:rPr>
           <w:rFonts w:ascii="Consolas" w:eastAsia="Times New Roman" w:hAnsi="Consolas" w:cs="Times New Roman"/>
@@ -13254,7 +12217,6 @@
         </w:rPr>
         <w:t>error</w:t>
       </w:r>
-      <w:proofErr w:type="gramStart"/>
       <w:r>
         <w:rPr>
           <w:rFonts w:ascii="Consolas" w:eastAsia="Times New Roman" w:hAnsi="Consolas" w:cs="Times New Roman"/>
@@ -13267,7 +12229,6 @@
         </w:rPr>
         <w:t>);</w:t>
       </w:r>
-      <w:proofErr w:type="gramEnd"/>
     </w:p>
     <w:p>
       <w:pPr>
@@ -13335,7 +12296,6 @@
         <w:t xml:space="preserve"> </w:t>
       </w:r>
       <w:proofErr w:type="spellStart"/>
-      <w:proofErr w:type="gramStart"/>
       <w:r>
         <w:rPr>
           <w:rFonts w:ascii="Consolas" w:eastAsia="Times New Roman" w:hAnsi="Consolas" w:cs="Times New Roman"/>
@@ -13375,7 +12335,6 @@
         <w:t>status</w:t>
       </w:r>
       <w:proofErr w:type="spellEnd"/>
-      <w:proofErr w:type="gramEnd"/>
       <w:r>
         <w:rPr>
           <w:rFonts w:ascii="Consolas" w:eastAsia="Times New Roman" w:hAnsi="Consolas" w:cs="Times New Roman"/>
@@ -13400,7 +12359,6 @@
         </w:rPr>
         <w:t>500</w:t>
       </w:r>
-      <w:proofErr w:type="gramStart"/>
       <w:r>
         <w:rPr>
           <w:rFonts w:ascii="Consolas" w:eastAsia="Times New Roman" w:hAnsi="Consolas" w:cs="Times New Roman"/>
@@ -13427,7 +12385,6 @@
         <w:t>json</w:t>
       </w:r>
       <w:proofErr w:type="spellEnd"/>
-      <w:proofErr w:type="gramEnd"/>
       <w:r>
         <w:rPr>
           <w:rFonts w:ascii="Consolas" w:eastAsia="Times New Roman" w:hAnsi="Consolas" w:cs="Times New Roman"/>
@@ -13540,22 +12497,8 @@
           <w:lang w:eastAsia="en-GB"/>
           <w14:ligatures w14:val="none"/>
         </w:rPr>
-        <w:t>    }</w:t>
-      </w:r>
-      <w:proofErr w:type="gramStart"/>
-      <w:r>
-        <w:rPr>
-          <w:rFonts w:ascii="Consolas" w:eastAsia="Times New Roman" w:hAnsi="Consolas" w:cs="Times New Roman"/>
-          <w:color w:val="BEA6A6"/>
-          <w:kern w:val="0"/>
-          <w:sz w:val="16"/>
-          <w:szCs w:val="16"/>
-          <w:lang w:eastAsia="en-GB"/>
-          <w14:ligatures w14:val="none"/>
-        </w:rPr>
-        <w:t>);</w:t>
-      </w:r>
-      <w:proofErr w:type="gramEnd"/>
+        <w:t>    });</w:t>
+      </w:r>
     </w:p>
     <w:p>
       <w:pPr>
@@ -13608,52 +12551,356 @@
           <w:lang w:eastAsia="en-GB"/>
           <w14:ligatures w14:val="none"/>
         </w:rPr>
-        <w:t>}</w:t>
-      </w:r>
-      <w:proofErr w:type="gramStart"/>
-      <w:r>
-        <w:rPr>
-          <w:rFonts w:ascii="Consolas" w:eastAsia="Times New Roman" w:hAnsi="Consolas" w:cs="Times New Roman"/>
-          <w:color w:val="BEA6A6"/>
-          <w:kern w:val="0"/>
-          <w:sz w:val="16"/>
-          <w:szCs w:val="16"/>
-          <w:lang w:eastAsia="en-GB"/>
-          <w14:ligatures w14:val="none"/>
-        </w:rPr>
-        <w:t>);</w:t>
-      </w:r>
-      <w:proofErr w:type="gramEnd"/>
-      <w:r>
-        <w:rPr>
-          <w:rFonts w:ascii="Consolas" w:eastAsia="Times New Roman" w:hAnsi="Consolas" w:cs="Times New Roman"/>
-          <w:color w:val="BEA6A6"/>
-          <w:kern w:val="0"/>
-          <w:sz w:val="16"/>
-          <w:szCs w:val="16"/>
-          <w:lang w:eastAsia="en-GB"/>
-          <w14:ligatures w14:val="none"/>
+        <w:t xml:space="preserve">}); </w:t>
+      </w:r>
+    </w:p>
+    <w:p>
+      <w:pPr>
+        <w:rPr>
+          <w:sz w:val="16"/>
+          <w:szCs w:val="16"/>
+          <w:lang w:val="en-US"/>
+        </w:rPr>
+      </w:pPr>
+    </w:p>
+    <w:p>
+      <w:pPr>
+        <w:rPr>
+          <w:lang w:val="en-US"/>
+        </w:rPr>
+      </w:pPr>
+      <w:r>
+        <w:rPr>
+          <w:lang w:val="en-US"/>
+        </w:rPr>
+        <w:t xml:space="preserve">The </w:t>
+      </w:r>
+      <w:r>
+        <w:rPr>
+          <w:lang w:val="en-US"/>
+        </w:rPr>
+        <w:t xml:space="preserve"> unit tests written have a broad coverage of functional scenarios – tests include a happy path test  &gt; verifies </w:t>
+      </w:r>
+      <w:r>
+        <w:rPr>
+          <w:lang w:val="en-US"/>
+        </w:rPr>
+        <w:t>correct behavior</w:t>
+      </w:r>
+      <w:r>
+        <w:rPr>
+          <w:lang w:val="en-US"/>
+        </w:rPr>
+        <w:t xml:space="preserve"> when the itinerary is valid. Test for budget constrains violations which </w:t>
+      </w:r>
+      <w:r>
+        <w:rPr>
+          <w:lang w:val="en-US"/>
+        </w:rPr>
+        <w:t>ensure</w:t>
+      </w:r>
+      <w:r>
+        <w:rPr>
+          <w:lang w:val="en-US"/>
+        </w:rPr>
+        <w:t xml:space="preserve"> that the subsystem correctly flags infeasible routes and provides appropriate suggestions.  Test for missing country coverage – to ensure that the constraint of all three countries of USA, Mexico, Canada are enforced. Validation tests for invalid input – ensuring robustness again malformed requests. Tests for error conditions e.g. origin city and/or invalid match id. And a correctness check for cost calculation – to verify that the total cost equals to the sum of its components. </w:t>
+      </w:r>
+      <w:r>
+        <w:rPr>
+          <w:lang w:val="en-US"/>
+        </w:rPr>
+        <w:t xml:space="preserve">Also handling of edge cases strengths, the approach of handling missing flight routes, testing when total cost equals the budget validates boundary conditions and to verify a 404 response is returned ensures proper error handling for proper error handling for invalid resources.  – By having clear test names, logical grouping using describe consistent assertion patterns and validation of both status code and response body structure. </w:t>
+      </w:r>
+    </w:p>
+    <w:p>
+      <w:pPr>
+        <w:rPr>
+          <w:lang w:val="en-US"/>
+        </w:rPr>
+      </w:pPr>
+      <w:r>
+        <w:rPr>
+          <w:lang w:val="en-US"/>
+        </w:rPr>
+        <w:t xml:space="preserve">Additional tests that could be added in later to improve coverage is to test negative budget input, duplicate match id’s, zero budget, large input dataset and exact country coverage – test scenarios where exactly one match per required country is included to ensure constraints are minimally satisfied. </w:t>
+      </w:r>
+    </w:p>
+    <w:p>
+      <w:pPr>
+        <w:pStyle w:val="Heading1"/>
+        <w:rPr>
+          <w:lang w:val="en-US"/>
+        </w:rPr>
+      </w:pPr>
+      <w:bookmarkStart w:id="8" w:name="_Toc226735796"/>
+      <w:r>
+        <w:rPr>
+          <w:lang w:val="en-US"/>
+        </w:rPr>
+        <w:t xml:space="preserve">Frontend  challenge – </w:t>
+      </w:r>
+      <w:proofErr w:type="spellStart"/>
+      <w:r>
+        <w:rPr>
+          <w:lang w:val="en-US"/>
+        </w:rPr>
+        <w:t>RouteMap</w:t>
+      </w:r>
+      <w:proofErr w:type="spellEnd"/>
+      <w:r>
+        <w:rPr>
+          <w:lang w:val="en-US"/>
         </w:rPr>
         <w:t xml:space="preserve"> </w:t>
       </w:r>
-    </w:p>
-    <w:p>
-      <w:pPr>
-        <w:rPr>
-          <w:sz w:val="16"/>
-          <w:szCs w:val="16"/>
-          <w:lang w:val="en-US"/>
-        </w:rPr>
-      </w:pPr>
-    </w:p>
-    <w:p>
-      <w:pPr>
-        <w:rPr>
-          <w:sz w:val="16"/>
-          <w:szCs w:val="16"/>
-          <w:lang w:val="en-US"/>
-        </w:rPr>
-      </w:pPr>
+      <w:r>
+        <w:rPr>
+          <w:lang w:val="en-US"/>
+        </w:rPr>
+        <w:t>Component</w:t>
+      </w:r>
+      <w:bookmarkEnd w:id="8"/>
+      <w:r>
+        <w:rPr>
+          <w:lang w:val="en-US"/>
+        </w:rPr>
+        <w:t xml:space="preserve"> </w:t>
+      </w:r>
+    </w:p>
+    <w:p>
+      <w:pPr>
+        <w:jc w:val="both"/>
+        <w:rPr>
+          <w:lang w:val="en-US"/>
+        </w:rPr>
+      </w:pPr>
+      <w:r>
+        <w:rPr>
+          <w:lang w:val="en-US"/>
+        </w:rPr>
+        <w:t xml:space="preserve">Key strength of this implementation is its handling of dynamic + potentially inconsistent structures – inclusion of the helper function to extract team names </w:t>
+      </w:r>
+      <w:proofErr w:type="spellStart"/>
+      <w:r>
+        <w:rPr>
+          <w:lang w:val="en-US"/>
+        </w:rPr>
+        <w:t>getTeamName</w:t>
+      </w:r>
+      <w:proofErr w:type="spellEnd"/>
+      <w:r>
+        <w:rPr>
+          <w:lang w:val="en-US"/>
+        </w:rPr>
+        <w:t xml:space="preserve"> ensures that  both strings + object based of teams are supported – defensive programming approach reduces the risk of runtime errors and improves robustness of the component. The structure of the rendered output is also well designed with clearly labeled stop number, competing teams in a readable format, formatted kickoff date using locale aware formatting.  The use of the provided CSS classes popup-match, popup-match-number and popup-match-date ensures visual consistency across the application  to the  design requirements. </w:t>
+      </w:r>
+      <w:r>
+        <w:rPr>
+          <w:lang w:val="en-US"/>
+        </w:rPr>
+        <w:t xml:space="preserve">Another strength is the correct use of React list rendering practices – each rendered element includes a unique match.id which helps react update the </w:t>
+      </w:r>
+      <w:proofErr w:type="spellStart"/>
+      <w:r>
+        <w:rPr>
+          <w:lang w:val="en-US"/>
+        </w:rPr>
+        <w:t>dom</w:t>
+      </w:r>
+      <w:proofErr w:type="spellEnd"/>
+      <w:r>
+        <w:rPr>
+          <w:lang w:val="en-US"/>
+        </w:rPr>
+        <w:t xml:space="preserve"> and prevent potential  rendering issues.  Also good </w:t>
+      </w:r>
+      <w:proofErr w:type="spellStart"/>
+      <w:r>
+        <w:rPr>
+          <w:lang w:val="en-US"/>
+        </w:rPr>
+        <w:t>reability</w:t>
+      </w:r>
+      <w:proofErr w:type="spellEnd"/>
+      <w:r>
+        <w:rPr>
+          <w:lang w:val="en-US"/>
+        </w:rPr>
+        <w:t xml:space="preserve"> through the use of destructing ( const {match, </w:t>
+      </w:r>
+      <w:proofErr w:type="spellStart"/>
+      <w:r>
+        <w:rPr>
+          <w:lang w:val="en-US"/>
+        </w:rPr>
+        <w:t>stopNumber</w:t>
+      </w:r>
+      <w:proofErr w:type="spellEnd"/>
+      <w:r>
+        <w:rPr>
+          <w:lang w:val="en-US"/>
+        </w:rPr>
+        <w:t xml:space="preserve"> } = stop) + logical separation of concerns within the mapping function – making the code easier to understand. </w:t>
+      </w:r>
+    </w:p>
+    <w:p>
+      <w:pPr>
+        <w:jc w:val="both"/>
+        <w:rPr>
+          <w:lang w:val="en-US"/>
+        </w:rPr>
+      </w:pPr>
+      <w:r>
+        <w:rPr>
+          <w:lang w:val="en-US"/>
+        </w:rPr>
+        <w:lastRenderedPageBreak/>
+        <w:t>Potential improvements-  extracting helper function  is currently defined inside the render loop and is recreated on every render – moving the function outside the component would improve performance and code hygiene and to have reusable date formatting.</w:t>
+      </w:r>
+    </w:p>
+    <w:p>
+      <w:pPr>
+        <w:jc w:val="both"/>
+        <w:rPr>
+          <w:lang w:val="en-US"/>
+        </w:rPr>
+      </w:pPr>
+    </w:p>
+    <w:p>
+      <w:pPr>
+        <w:jc w:val="both"/>
+        <w:rPr>
+          <w:lang w:val="en-US"/>
+        </w:rPr>
+      </w:pPr>
+      <w:r>
+        <w:rPr>
+          <w:lang w:val="en-US"/>
+        </w:rPr>
+        <w:t xml:space="preserve">An alternative design would involve </w:t>
+      </w:r>
+      <w:proofErr w:type="spellStart"/>
+      <w:r>
+        <w:rPr>
+          <w:lang w:val="en-US"/>
+        </w:rPr>
+        <w:t>pre processing</w:t>
+      </w:r>
+      <w:proofErr w:type="spellEnd"/>
+      <w:r>
+        <w:rPr>
+          <w:lang w:val="en-US"/>
+        </w:rPr>
+        <w:t xml:space="preserve"> the route data before rendering – this would simplify rendering logic + reduce repeated computations or another </w:t>
+      </w:r>
+      <w:r>
+        <w:rPr>
+          <w:lang w:val="en-US"/>
+        </w:rPr>
+        <w:t>approach</w:t>
+      </w:r>
+      <w:r>
+        <w:rPr>
+          <w:lang w:val="en-US"/>
+        </w:rPr>
+        <w:t xml:space="preserve"> would be a dedicated child component for each match entry – would improve separation of concerns + make the UI more scalable as additional features such as  icons.  </w:t>
+      </w:r>
+    </w:p>
+    <w:p>
+      <w:pPr>
+        <w:jc w:val="both"/>
+        <w:rPr>
+          <w:lang w:val="en-US"/>
+        </w:rPr>
+      </w:pPr>
+      <w:r>
+        <w:rPr>
+          <w:lang w:val="en-US"/>
+        </w:rPr>
+        <w:t xml:space="preserve">Despite these alternatives/refactoring the current implementation is suited to the scope of the project as it achieves good balance between simplicity + functionality – avoiding unnecessary abstraction whilst marinating clarity and correctness. </w:t>
+      </w:r>
+    </w:p>
+    <w:p>
+      <w:pPr>
+        <w:jc w:val="both"/>
+        <w:rPr>
+          <w:lang w:val="en-US"/>
+        </w:rPr>
+      </w:pPr>
+    </w:p>
+    <w:p>
+      <w:pPr>
+        <w:jc w:val="both"/>
+        <w:rPr>
+          <w:lang w:val="en-US"/>
+        </w:rPr>
+      </w:pPr>
+      <w:r>
+        <w:rPr>
+          <w:noProof/>
+        </w:rPr>
+        <w:drawing>
+          <wp:inline distT="0" distB="0" distL="0" distR="0" wp14:anchorId="4FB3ADC0" wp14:editId="1F24E822">
+            <wp:extent cx="5731510" cy="4791710"/>
+            <wp:effectExtent l="0" t="0" r="2540" b="8890"/>
+            <wp:docPr id="1546554050" name="Picture 1"/>
+            <wp:cNvGraphicFramePr>
+              <a:graphicFrameLocks xmlns:a="http://schemas.openxmlformats.org/drawingml/2006/main" noChangeAspect="1"/>
+            </wp:cNvGraphicFramePr>
+            <a:graphic xmlns:a="http://schemas.openxmlformats.org/drawingml/2006/main">
+              <a:graphicData uri="http://schemas.openxmlformats.org/drawingml/2006/picture">
+                <pic:pic xmlns:pic="http://schemas.openxmlformats.org/drawingml/2006/picture">
+                  <pic:nvPicPr>
+                    <pic:cNvPr id="1546554050" name=""/>
+                    <pic:cNvPicPr/>
+                  </pic:nvPicPr>
+                  <pic:blipFill>
+                    <a:blip r:embed="rId12"/>
+                    <a:stretch>
+                      <a:fillRect/>
+                    </a:stretch>
+                  </pic:blipFill>
+                  <pic:spPr>
+                    <a:xfrm>
+                      <a:off x="0" y="0"/>
+                      <a:ext cx="5731510" cy="4791710"/>
+                    </a:xfrm>
+                    <a:prstGeom prst="rect">
+                      <a:avLst/>
+                    </a:prstGeom>
+                  </pic:spPr>
+                </pic:pic>
+              </a:graphicData>
+            </a:graphic>
+          </wp:inline>
+        </w:drawing>
+      </w:r>
+      <w:r>
+        <w:rPr>
+          <w:lang w:val="en-US"/>
+        </w:rPr>
+        <w:t xml:space="preserve"> </w:t>
+      </w:r>
+    </w:p>
+    <w:p>
+      <w:pPr>
+        <w:rPr>
+          <w:lang w:val="en-US"/>
+        </w:rPr>
+      </w:pPr>
+      <w:r>
+        <w:rPr>
+          <w:lang w:val="en-US"/>
+        </w:rPr>
+        <w:t xml:space="preserve">The unit tests implemented using Jest + React testing library focus on validating core component behavior by mocking the react-leaflet library – tests avoid reliance on external map rendering + concentrate on verifying logical output – ensures that placeholder is correctly displayed when no route is provided, map container renders when valid route data exists, markers are generated based on number of stops, edge case such as empty routes are handled well. However, in the future I would like to combine these unit/integration tests with E2E tests </w:t>
+      </w:r>
+      <w:r>
+        <w:rPr>
+          <w:lang w:val="en-US"/>
+        </w:rPr>
+        <w:lastRenderedPageBreak/>
+        <w:t xml:space="preserve">using Cypress as this would be able to validate the full user workflow and UI just not the API and component logic in isolation.  For example to test map is rendering,  markers are rendered with stop number, team names, kickoff date, and the user flow test of user chooses matches, choose origin city, plan route and calculate budget and that the UI updates at each stage and alongside ensuring that appropriate messages appear when requirements are not met. </w:t>
+      </w:r>
     </w:p>
     <w:p>
       <w:pPr>
@@ -13662,91 +12909,20 @@
           <w:lang w:val="en-US"/>
         </w:rPr>
       </w:pPr>
-      <w:bookmarkStart w:id="8" w:name="_Toc226732823"/>
-      <w:proofErr w:type="gramStart"/>
-      <w:r>
-        <w:rPr>
-          <w:lang w:val="en-US"/>
-        </w:rPr>
-        <w:t>Frontend  challenge</w:t>
-      </w:r>
-      <w:proofErr w:type="gramEnd"/>
-      <w:r>
-        <w:rPr>
-          <w:lang w:val="en-US"/>
-        </w:rPr>
-        <w:t xml:space="preserve"> – </w:t>
-      </w:r>
-      <w:proofErr w:type="spellStart"/>
-      <w:r>
-        <w:rPr>
-          <w:lang w:val="en-US"/>
-        </w:rPr>
-        <w:t>RouteMap</w:t>
-      </w:r>
-      <w:proofErr w:type="spellEnd"/>
+      <w:bookmarkStart w:id="9" w:name="_Toc226735797"/>
+      <w:r>
+        <w:rPr>
+          <w:lang w:val="en-US"/>
+        </w:rPr>
+        <w:t>Postman</w:t>
+      </w:r>
+      <w:bookmarkEnd w:id="9"/>
       <w:r>
         <w:rPr>
           <w:lang w:val="en-US"/>
         </w:rPr>
         <w:t xml:space="preserve"> </w:t>
       </w:r>
-      <w:proofErr w:type="spellStart"/>
-      <w:r>
-        <w:rPr>
-          <w:lang w:val="en-US"/>
-        </w:rPr>
-        <w:t>Componment</w:t>
-      </w:r>
-      <w:bookmarkEnd w:id="8"/>
-      <w:proofErr w:type="spellEnd"/>
-      <w:r>
-        <w:rPr>
-          <w:lang w:val="en-US"/>
-        </w:rPr>
-        <w:t xml:space="preserve"> </w:t>
-      </w:r>
-    </w:p>
-    <w:p>
-      <w:pPr>
-        <w:rPr>
-          <w:lang w:val="en-US"/>
-        </w:rPr>
-      </w:pPr>
-    </w:p>
-    <w:p>
-      <w:pPr>
-        <w:rPr>
-          <w:lang w:val="en-US"/>
-        </w:rPr>
-      </w:pPr>
-      <w:r>
-        <w:rPr>
-          <w:lang w:val="en-US"/>
-        </w:rPr>
-        <w:t xml:space="preserve">//frontend cypress </w:t>
-      </w:r>
-      <w:proofErr w:type="spellStart"/>
-      <w:r>
-        <w:rPr>
-          <w:lang w:val="en-US"/>
-        </w:rPr>
-        <w:t>testys</w:t>
-      </w:r>
-      <w:proofErr w:type="spellEnd"/>
-      <w:r>
-        <w:rPr>
-          <w:lang w:val="en-US"/>
-        </w:rPr>
-        <w:t xml:space="preserve"> </w:t>
-      </w:r>
-    </w:p>
-    <w:p>
-      <w:pPr>
-        <w:rPr>
-          <w:lang w:val="en-US"/>
-        </w:rPr>
-      </w:pPr>
     </w:p>
     <w:p>
       <w:pPr>
@@ -13755,58 +12931,36 @@
           <w:lang w:val="en-US"/>
         </w:rPr>
       </w:pPr>
-      <w:bookmarkStart w:id="9" w:name="_Toc226732824"/>
-      <w:r>
-        <w:rPr>
-          <w:lang w:val="en-US"/>
-        </w:rPr>
-        <w:t>Postman</w:t>
-      </w:r>
-      <w:bookmarkEnd w:id="9"/>
-      <w:r>
-        <w:rPr>
-          <w:lang w:val="en-US"/>
-        </w:rPr>
-        <w:t xml:space="preserve"> </w:t>
-      </w:r>
+      <w:bookmarkStart w:id="10" w:name="_Toc226735798"/>
+      <w:r>
+        <w:rPr>
+          <w:lang w:val="en-US"/>
+        </w:rPr>
+        <w:t>ReadMe</w:t>
+      </w:r>
+      <w:bookmarkEnd w:id="10"/>
     </w:p>
     <w:p>
       <w:pPr>
         <w:pStyle w:val="Heading1"/>
-        <w:rPr>
-          <w:lang w:val="en-US"/>
-        </w:rPr>
-      </w:pPr>
-      <w:bookmarkStart w:id="10" w:name="_Toc226732825"/>
-      <w:r>
-        <w:rPr>
-          <w:lang w:val="en-US"/>
-        </w:rPr>
-        <w:t>ReadMe</w:t>
-      </w:r>
-      <w:bookmarkEnd w:id="10"/>
-    </w:p>
+      </w:pPr>
+      <w:bookmarkStart w:id="11" w:name="_Toc226735799"/>
+      <w:r>
+        <w:t>Other notes</w:t>
+      </w:r>
+      <w:bookmarkEnd w:id="11"/>
+    </w:p>
+    <w:p>
+      <w:r>
+        <w:t xml:space="preserve">// budget being able to be manually set  </w:t>
+      </w:r>
+    </w:p>
+    <w:p/>
     <w:p>
       <w:pPr>
         <w:pStyle w:val="Heading1"/>
       </w:pPr>
-      <w:bookmarkStart w:id="11" w:name="_Toc226732826"/>
-      <w:r>
-        <w:t>Other notes</w:t>
-      </w:r>
-      <w:bookmarkEnd w:id="11"/>
-    </w:p>
-    <w:p>
-      <w:r>
-        <w:t xml:space="preserve">// budget being able to be manually set  </w:t>
-      </w:r>
-    </w:p>
-    <w:p/>
-    <w:p>
-      <w:pPr>
-        <w:pStyle w:val="Heading1"/>
-      </w:pPr>
-      <w:bookmarkStart w:id="12" w:name="_Toc226732827"/>
+      <w:bookmarkStart w:id="12" w:name="_Toc226735800"/>
       <w:r>
         <w:t>Bonus Challenge</w:t>
       </w:r>
@@ -13834,7 +12988,7 @@
       <w:pPr>
         <w:pStyle w:val="Heading1"/>
       </w:pPr>
-      <w:bookmarkStart w:id="13" w:name="_Toc226732828"/>
+      <w:bookmarkStart w:id="13" w:name="_Toc226735801"/>
       <w:r>
         <w:t xml:space="preserve">Future </w:t>
       </w:r>
@@ -13844,6 +12998,67 @@
       <w:bookmarkEnd w:id="13"/>
     </w:p>
     <w:p>
+      <w:r>
+        <w:t xml:space="preserve">/  </w:t>
+      </w:r>
+      <w:proofErr w:type="spellStart"/>
+      <w:r>
+        <w:t>scould</w:t>
+      </w:r>
+      <w:proofErr w:type="spellEnd"/>
+      <w:r>
+        <w:t xml:space="preserve"> have the option to let the user</w:t>
+      </w:r>
+      <w:r>
+        <w:t xml:space="preserve"> how many countries they want to visit and what they </w:t>
+      </w:r>
+      <w:proofErr w:type="spellStart"/>
+      <w:r>
+        <w:t>acruakkt</w:t>
+      </w:r>
+      <w:proofErr w:type="spellEnd"/>
+      <w:r>
+        <w:t xml:space="preserve"> </w:t>
+      </w:r>
+      <w:proofErr w:type="spellStart"/>
+      <w:r>
+        <w:t>wanna</w:t>
+      </w:r>
+      <w:proofErr w:type="spellEnd"/>
+      <w:r>
+        <w:t xml:space="preserve"> </w:t>
+      </w:r>
+      <w:proofErr w:type="spellStart"/>
+      <w:r>
+        <w:t>doi</w:t>
+      </w:r>
+      <w:proofErr w:type="spellEnd"/>
+      <w:r>
+        <w:t xml:space="preserve"> instead of just </w:t>
+      </w:r>
+      <w:proofErr w:type="spellStart"/>
+      <w:r>
+        <w:t>followinmhg</w:t>
+      </w:r>
+      <w:proofErr w:type="spellEnd"/>
+      <w:r>
+        <w:t xml:space="preserve"> </w:t>
+      </w:r>
+      <w:proofErr w:type="spellStart"/>
+      <w:r>
+        <w:t>presaet</w:t>
+      </w:r>
+      <w:proofErr w:type="spellEnd"/>
+      <w:r>
+        <w:t xml:space="preserve"> </w:t>
+      </w:r>
+    </w:p>
+    <w:p>
+      <w:r>
+        <w:t xml:space="preserve"> </w:t>
+      </w:r>
+    </w:p>
+    <w:p>
       <w:pPr>
         <w:rPr>
           <w:lang w:val="en-US"/>
@@ -13912,7 +13127,6 @@
         <w:t xml:space="preserve">// future </w:t>
       </w:r>
       <w:proofErr w:type="spellStart"/>
-      <w:proofErr w:type="gramStart"/>
       <w:r>
         <w:rPr>
           <w:lang w:val="en-US"/>
@@ -13920,7 +13134,6 @@
         <w:t>imptove,ents</w:t>
       </w:r>
       <w:proofErr w:type="spellEnd"/>
-      <w:proofErr w:type="gramEnd"/>
       <w:r>
         <w:rPr>
           <w:lang w:val="en-US"/>
@@ -13928,7 +13141,6 @@
         <w:t xml:space="preserve"> – ci/cd </w:t>
       </w:r>
       <w:proofErr w:type="spellStart"/>
-      <w:proofErr w:type="gramStart"/>
       <w:r>
         <w:rPr>
           <w:lang w:val="en-US"/>
@@ -13950,7 +13162,6 @@
         <w:t>r;ines</w:t>
       </w:r>
       <w:proofErr w:type="spellEnd"/>
-      <w:proofErr w:type="gramEnd"/>
       <w:r>
         <w:rPr>
           <w:lang w:val="en-US"/>
@@ -14010,15 +13221,7 @@
         <w:rPr>
           <w:lang w:val="en-US"/>
         </w:rPr>
-        <w:lastRenderedPageBreak/>
-        <w:t xml:space="preserve">// more </w:t>
-      </w:r>
-      <w:proofErr w:type="gramStart"/>
-      <w:r>
-        <w:rPr>
-          <w:lang w:val="en-US"/>
-        </w:rPr>
-        <w:t xml:space="preserve">testing  </w:t>
+        <w:t xml:space="preserve">// more testing  </w:t>
       </w:r>
       <w:proofErr w:type="spellStart"/>
       <w:r>
@@ -14028,7 +13231,6 @@
         <w:t>ofd</w:t>
       </w:r>
       <w:proofErr w:type="spellEnd"/>
-      <w:proofErr w:type="gramEnd"/>
       <w:r>
         <w:rPr>
           <w:lang w:val="en-US"/>

</xml_diff>